<commit_message>
Proposal: add "Why Qwen3-VL" (adoption, adaptability, novelties)
Adoption evidence from the Hugging Face API (download counts, Hub
derivative counts vs. Qwen2.5-VL / InternVL3 / Llama 3.2 Vision,
framework support), adaptability across sizes and modalities, and the
architectural (interleaved-MRoPE, DeepStack, textual video timestamps,
dynamic-resolution SigLIP-2) and training-recipe (staged curriculum,
sqrt-normalized per-token loss) novelties from the technical report.
Regenerated .docx.

Co-Authored-By: Claude Fable 5.1 <noreply@anthropic.com>
</commit_message>
<xml_diff>
--- a/qwen-vl-finetune/docs/proposal/MLPerf_Training_proposal_Qwen3-VL.docx
+++ b/qwen-vl-finetune/docs/proposal/MLPerf_Training_proposal_Qwen3-VL.docx
@@ -410,6 +410,482 @@
     </w:p>
     <w:p>
       <w:pPr>
+        <w:pStyle w:val="Heading3"/>
+      </w:pPr>
+      <w:r>
+        <w:t>Why Qwen3-VL</w:t>
+      </w:r>
+    </w:p>
+    <w:p>
+      <w:r>
+        <w:rPr>
+          <w:b/>
+        </w:rPr>
+        <w:t>Adoption and ecosystem.</w:t>
+      </w:r>
+      <w:r>
+        <w:t xml:space="preserve"> Qwen3-VL is the most widely adopted open VLM family today, which matters for a benchmark that should reflect what the community actually trains and deploys:</w:t>
+      </w:r>
+    </w:p>
+    <w:tbl>
+      <w:tblPr>
+        <w:tblStyle w:val="TableGrid"/>
+        <w:tblW w:type="auto" w:w="0"/>
+        <w:tblLook w:firstColumn="1" w:firstRow="1" w:lastColumn="0" w:lastRow="0" w:noHBand="0" w:noVBand="1" w:val="04A0"/>
+      </w:tblPr>
+      <w:tblGrid>
+        <w:gridCol w:w="2340"/>
+        <w:gridCol w:w="2340"/>
+        <w:gridCol w:w="2340"/>
+        <w:gridCol w:w="2340"/>
+      </w:tblGrid>
+      <w:tr>
+        <w:tc>
+          <w:tcPr>
+            <w:tcW w:type="dxa" w:w="2340"/>
+          </w:tcPr>
+          <w:p>
+            <w:r>
+              <w:rPr>
+                <w:b/>
+                <w:sz w:val="18"/>
+              </w:rPr>
+            </w:r>
+          </w:p>
+        </w:tc>
+        <w:tc>
+          <w:tcPr>
+            <w:tcW w:type="dxa" w:w="2340"/>
+          </w:tcPr>
+          <w:p>
+            <w:r>
+              <w:rPr>
+                <w:b/>
+                <w:sz w:val="18"/>
+              </w:rPr>
+            </w:r>
+            <w:r>
+              <w:rPr>
+                <w:b/>
+                <w:sz w:val="18"/>
+              </w:rPr>
+              <w:t>Qwen3-VL-8B-Instruct</w:t>
+            </w:r>
+          </w:p>
+        </w:tc>
+        <w:tc>
+          <w:tcPr>
+            <w:tcW w:type="dxa" w:w="2340"/>
+          </w:tcPr>
+          <w:p>
+            <w:r>
+              <w:rPr>
+                <w:b/>
+                <w:sz w:val="18"/>
+              </w:rPr>
+            </w:r>
+            <w:r>
+              <w:rPr>
+                <w:b/>
+                <w:sz w:val="18"/>
+              </w:rPr>
+              <w:t>Qwen3-VL-32B-Instruct</w:t>
+            </w:r>
+          </w:p>
+        </w:tc>
+        <w:tc>
+          <w:tcPr>
+            <w:tcW w:type="dxa" w:w="2340"/>
+          </w:tcPr>
+          <w:p>
+            <w:r>
+              <w:rPr>
+                <w:b/>
+                <w:sz w:val="18"/>
+              </w:rPr>
+            </w:r>
+            <w:r>
+              <w:rPr>
+                <w:b/>
+                <w:sz w:val="18"/>
+              </w:rPr>
+              <w:t>Qwen3-VL-235B-A22B-Instruct</w:t>
+            </w:r>
+          </w:p>
+        </w:tc>
+      </w:tr>
+      <w:tr>
+        <w:tc>
+          <w:tcPr>
+            <w:tcW w:type="dxa" w:w="2340"/>
+          </w:tcPr>
+          <w:p>
+            <w:r>
+              <w:rPr>
+                <w:sz w:val="18"/>
+              </w:rPr>
+            </w:r>
+            <w:r>
+              <w:rPr>
+                <w:sz w:val="18"/>
+              </w:rPr>
+              <w:t>Released</w:t>
+            </w:r>
+          </w:p>
+        </w:tc>
+        <w:tc>
+          <w:tcPr>
+            <w:tcW w:type="dxa" w:w="2340"/>
+          </w:tcPr>
+          <w:p>
+            <w:r>
+              <w:rPr>
+                <w:sz w:val="18"/>
+              </w:rPr>
+            </w:r>
+            <w:r>
+              <w:rPr>
+                <w:sz w:val="18"/>
+              </w:rPr>
+              <w:t>2025-10</w:t>
+            </w:r>
+          </w:p>
+        </w:tc>
+        <w:tc>
+          <w:tcPr>
+            <w:tcW w:type="dxa" w:w="2340"/>
+          </w:tcPr>
+          <w:p>
+            <w:r>
+              <w:rPr>
+                <w:sz w:val="18"/>
+              </w:rPr>
+            </w:r>
+            <w:r>
+              <w:rPr>
+                <w:sz w:val="18"/>
+              </w:rPr>
+              <w:t>2025-10</w:t>
+            </w:r>
+          </w:p>
+        </w:tc>
+        <w:tc>
+          <w:tcPr>
+            <w:tcW w:type="dxa" w:w="2340"/>
+          </w:tcPr>
+          <w:p>
+            <w:r>
+              <w:rPr>
+                <w:sz w:val="18"/>
+              </w:rPr>
+            </w:r>
+            <w:r>
+              <w:rPr>
+                <w:sz w:val="18"/>
+              </w:rPr>
+              <w:t>2025-09</w:t>
+            </w:r>
+          </w:p>
+        </w:tc>
+      </w:tr>
+      <w:tr>
+        <w:tc>
+          <w:tcPr>
+            <w:tcW w:type="dxa" w:w="2340"/>
+          </w:tcPr>
+          <w:p>
+            <w:r>
+              <w:rPr>
+                <w:sz w:val="18"/>
+              </w:rPr>
+            </w:r>
+            <w:r>
+              <w:rPr>
+                <w:sz w:val="18"/>
+              </w:rPr>
+              <w:t>Hugging Face downloads, all time</w:t>
+            </w:r>
+          </w:p>
+        </w:tc>
+        <w:tc>
+          <w:tcPr>
+            <w:tcW w:type="dxa" w:w="2340"/>
+          </w:tcPr>
+          <w:p>
+            <w:r>
+              <w:rPr>
+                <w:sz w:val="18"/>
+              </w:rPr>
+            </w:r>
+            <w:r>
+              <w:rPr>
+                <w:sz w:val="18"/>
+              </w:rPr>
+              <w:t>61.7M</w:t>
+            </w:r>
+          </w:p>
+        </w:tc>
+        <w:tc>
+          <w:tcPr>
+            <w:tcW w:type="dxa" w:w="2340"/>
+          </w:tcPr>
+          <w:p>
+            <w:r>
+              <w:rPr>
+                <w:sz w:val="18"/>
+              </w:rPr>
+            </w:r>
+            <w:r>
+              <w:rPr>
+                <w:sz w:val="18"/>
+              </w:rPr>
+              <w:t>17.1M</w:t>
+            </w:r>
+          </w:p>
+        </w:tc>
+        <w:tc>
+          <w:tcPr>
+            <w:tcW w:type="dxa" w:w="2340"/>
+          </w:tcPr>
+          <w:p>
+            <w:r>
+              <w:rPr>
+                <w:sz w:val="18"/>
+              </w:rPr>
+            </w:r>
+            <w:r>
+              <w:rPr>
+                <w:sz w:val="18"/>
+              </w:rPr>
+              <w:t>9.3M</w:t>
+            </w:r>
+          </w:p>
+        </w:tc>
+      </w:tr>
+      <w:tr>
+        <w:tc>
+          <w:tcPr>
+            <w:tcW w:type="dxa" w:w="2340"/>
+          </w:tcPr>
+          <w:p>
+            <w:r>
+              <w:rPr>
+                <w:sz w:val="18"/>
+              </w:rPr>
+            </w:r>
+            <w:r>
+              <w:rPr>
+                <w:sz w:val="18"/>
+              </w:rPr>
+              <w:t>Hugging Face downloads, last 30 days</w:t>
+            </w:r>
+          </w:p>
+        </w:tc>
+        <w:tc>
+          <w:tcPr>
+            <w:tcW w:type="dxa" w:w="2340"/>
+          </w:tcPr>
+          <w:p>
+            <w:r>
+              <w:rPr>
+                <w:sz w:val="18"/>
+              </w:rPr>
+            </w:r>
+            <w:r>
+              <w:rPr>
+                <w:sz w:val="18"/>
+              </w:rPr>
+              <w:t>15.2M</w:t>
+            </w:r>
+          </w:p>
+        </w:tc>
+        <w:tc>
+          <w:tcPr>
+            <w:tcW w:type="dxa" w:w="2340"/>
+          </w:tcPr>
+          <w:p>
+            <w:r>
+              <w:rPr>
+                <w:sz w:val="18"/>
+              </w:rPr>
+            </w:r>
+            <w:r>
+              <w:rPr>
+                <w:sz w:val="18"/>
+              </w:rPr>
+              <w:t>0.4M</w:t>
+            </w:r>
+          </w:p>
+        </w:tc>
+        <w:tc>
+          <w:tcPr>
+            <w:tcW w:type="dxa" w:w="2340"/>
+          </w:tcPr>
+          <w:p>
+            <w:r>
+              <w:rPr>
+                <w:sz w:val="18"/>
+              </w:rPr>
+            </w:r>
+            <w:r>
+              <w:rPr>
+                <w:sz w:val="18"/>
+              </w:rPr>
+              <w:t>0.5M</w:t>
+            </w:r>
+          </w:p>
+        </w:tc>
+      </w:tr>
+    </w:tbl>
+    <w:p/>
+    <w:p>
+      <w:r>
+        <w:t xml:space="preserve">Hub repositories carrying the family name (fine-tunes, quantizations, merges): ~5,700 for Qwen3-VL vs. ~3,600 for its predecessor Qwen2.5-VL, ~860 for InternVL3 and ~440 for Llama-3.2-11B-Vision (Hugging Face API, 2026-09). The architecture is a native </w:t>
+      </w:r>
+      <w:r>
+        <w:rPr>
+          <w:rFonts w:ascii="Courier New" w:hAnsi="Courier New"/>
+        </w:rPr>
+        <w:t>transformers</w:t>
+      </w:r>
+      <w:r>
+        <w:t xml:space="preserve"> model class (no remote code), is supported by the major inference stacks (vLLM, TensorRT-LLM) and by the mainstream fine-tuning toolkits (LLaMA-Factory, ms-swift) — so a reference implementation built on it is portable, and the model people benchmark is the model people use.</w:t>
+      </w:r>
+    </w:p>
+    <w:p>
+      <w:r>
+        <w:rPr>
+          <w:b/>
+        </w:rPr>
+        <w:t>Adaptability.</w:t>
+      </w:r>
+      <w:r>
+        <w:t xml:space="preserve"> One architecture spans dense 2B → 32B and MoE 30B-A3B → 235B-A22B, and one recipe covers images, multi-image, video, documents, grounding and GUI-agent data at 8K → 256K context — the benchmark model can be scaled or re-scoped without changing the workload's structure. The Instruct checkpoint also adapts readily to new data: in our runs, eval loss on an unseen interleaved corpus fell from 2.98 to 2.42 within ~125k samples with full-parameter training that was stable across all seeds.</w:t>
+      </w:r>
+    </w:p>
+    <w:p>
+      <w:r>
+        <w:rPr>
+          <w:b/>
+        </w:rPr>
+        <w:t>Architectural novelties</w:t>
+      </w:r>
+      <w:r>
+        <w:t xml:space="preserve"> (Qwen3-VL technical report):</w:t>
+      </w:r>
+    </w:p>
+    <w:p>
+      <w:pPr>
+        <w:pStyle w:val="ListNumber"/>
+        <w:numPr>
+          <w:ilvl w:val="0"/>
+          <w:numId w:val="12"/>
+        </w:numPr>
+      </w:pPr>
+      <w:r>
+        <w:rPr>
+          <w:b/>
+        </w:rPr>
+        <w:t>Interleaved-MRoPE.</w:t>
+      </w:r>
+      <w:r>
+        <w:t xml:space="preserve"> Qwen2.5-VL's MRoPE chunked the embedding dimensions into temporal / height / width groups, which skews the frequency spectrum and hurts long video; Qwen3-VL interleaves t, h and w across low- and high-frequency bands for more faithful positions.</w:t>
+      </w:r>
+    </w:p>
+    <w:p>
+      <w:pPr>
+        <w:pStyle w:val="ListNumber"/>
+        <w:numPr>
+          <w:ilvl w:val="0"/>
+          <w:numId w:val="12"/>
+        </w:numPr>
+      </w:pPr>
+      <w:r>
+        <w:rPr>
+          <w:b/>
+        </w:rPr>
+        <w:t>DeepStack cross-layer fusion.</w:t>
+      </w:r>
+      <w:r>
+        <w:t xml:space="preserve"> Visual tokens taken from several </w:t>
+      </w:r>
+      <w:r>
+        <w:rPr>
+          <w:i/>
+        </w:rPr>
+        <w:t>intermediate</w:t>
+      </w:r>
+      <w:r>
+        <w:t xml:space="preserve"> ViT layers are routed into the corresponding early LLM layers through lightweight residual connections — multi-level vision-language fusion at no extra context length. (An extension of the original DeepStack, which stacked multi-scale inputs.) For a benchmark this adds a genuinely different dataflow: vision features enter the decoder at several depths, not only at the input embedding.</w:t>
+      </w:r>
+    </w:p>
+    <w:p>
+      <w:pPr>
+        <w:pStyle w:val="ListNumber"/>
+        <w:numPr>
+          <w:ilvl w:val="0"/>
+          <w:numId w:val="12"/>
+        </w:numPr>
+      </w:pPr>
+      <w:r>
+        <w:rPr>
+          <w:b/>
+        </w:rPr>
+        <w:t>Explicit video timestamps.</w:t>
+      </w:r>
+      <w:r>
+        <w:t xml:space="preserve"> Textual timestamp tokens (e.g. </w:t>
+      </w:r>
+      <w:r>
+        <w:rPr>
+          <w:rFonts w:ascii="Courier New" w:hAnsi="Courier New"/>
+        </w:rPr>
+        <w:t>&lt;3.0 seconds&gt;</w:t>
+      </w:r>
+      <w:r>
+        <w:t>) replace positional-encoding-based absolute time alignment (T-RoPE), a simpler and more direct temporal representation.</w:t>
+      </w:r>
+    </w:p>
+    <w:p>
+      <w:pPr>
+        <w:pStyle w:val="ListNumber"/>
+        <w:numPr>
+          <w:ilvl w:val="0"/>
+          <w:numId w:val="12"/>
+        </w:numPr>
+      </w:pPr>
+      <w:r>
+        <w:rPr>
+          <w:b/>
+        </w:rPr>
+        <w:t>Dynamic-resolution SigLIP-2 encoder.</w:t>
+      </w:r>
+      <w:r>
+        <w:t xml:space="preserve"> The 27-layer ViT is a SigLIP-2 SO-400M initialization continued-trained at native resolution with 2D-RoPE and interpolated absolute positions, so each image costs a variable number of tokens (one per 32×32 px).</w:t>
+      </w:r>
+    </w:p>
+    <w:p>
+      <w:r>
+        <w:rPr>
+          <w:b/>
+        </w:rPr>
+        <w:t>Training-recipe novelties.</w:t>
+      </w:r>
+      <w:r>
+        <w:t xml:space="preserve"> A staged pretraining curriculum (merger-only alignment → full-parameter multimodal pretraining at 8K → long-context at 32K → 256K) with text-only data deliberately mixed in to preserve language ability; a </w:t>
+      </w:r>
+      <w:r>
+        <w:rPr>
+          <w:b/>
+        </w:rPr>
+        <w:t>square-root-normalized per-token loss</w:t>
+      </w:r>
+      <w:r>
+        <w:t xml:space="preserve"> replacing the per-sample loss to balance text and multimodal data; and post-training with long chain-of-thought SFT, strong-to-weak distillation and RL into separate thinking / non-thinking variants. Our proposed workload reproduces the core of the second stage — the one that dominates the compute budget.</w:t>
+      </w:r>
+    </w:p>
+    <w:p>
+      <w:pPr>
         <w:pStyle w:val="Heading2"/>
       </w:pPr>
       <w:r>
@@ -429,7 +905,7 @@
         <w:pStyle w:val="ListNumber"/>
         <w:numPr>
           <w:ilvl w:val="0"/>
-          <w:numId w:val="12"/>
+          <w:numId w:val="13"/>
         </w:numPr>
       </w:pPr>
       <w:r>
@@ -450,7 +926,7 @@
         <w:pStyle w:val="ListNumber"/>
         <w:numPr>
           <w:ilvl w:val="0"/>
-          <w:numId w:val="12"/>
+          <w:numId w:val="13"/>
         </w:numPr>
       </w:pPr>
       <w:r>
@@ -462,7 +938,7 @@
         <w:pStyle w:val="ListNumber"/>
         <w:numPr>
           <w:ilvl w:val="0"/>
-          <w:numId w:val="12"/>
+          <w:numId w:val="13"/>
         </w:numPr>
       </w:pPr>
       <w:r>
@@ -474,7 +950,7 @@
         <w:pStyle w:val="ListNumber"/>
         <w:numPr>
           <w:ilvl w:val="0"/>
-          <w:numId w:val="12"/>
+          <w:numId w:val="13"/>
         </w:numPr>
       </w:pPr>
       <w:r>
@@ -1714,7 +2190,7 @@
         <w:pStyle w:val="ListNumber"/>
         <w:numPr>
           <w:ilvl w:val="0"/>
-          <w:numId w:val="13"/>
+          <w:numId w:val="14"/>
         </w:numPr>
       </w:pPr>
       <w:r>
@@ -1741,7 +2217,7 @@
         <w:pStyle w:val="ListNumber"/>
         <w:numPr>
           <w:ilvl w:val="0"/>
-          <w:numId w:val="13"/>
+          <w:numId w:val="14"/>
         </w:numPr>
       </w:pPr>
       <w:r>
@@ -1759,7 +2235,7 @@
         <w:pStyle w:val="ListNumber"/>
         <w:numPr>
           <w:ilvl w:val="0"/>
-          <w:numId w:val="13"/>
+          <w:numId w:val="14"/>
         </w:numPr>
       </w:pPr>
       <w:r>
@@ -1777,7 +2253,7 @@
         <w:pStyle w:val="ListNumber"/>
         <w:numPr>
           <w:ilvl w:val="0"/>
-          <w:numId w:val="13"/>
+          <w:numId w:val="14"/>
         </w:numPr>
       </w:pPr>
       <w:r>
@@ -1795,7 +2271,7 @@
         <w:pStyle w:val="ListNumber"/>
         <w:numPr>
           <w:ilvl w:val="0"/>
-          <w:numId w:val="13"/>
+          <w:numId w:val="14"/>
         </w:numPr>
       </w:pPr>
       <w:r>
@@ -2037,6 +2513,12 @@
     </w:lvlOverride>
   </w:num>
   <w:num w:numId="13">
+    <w:abstractNumId w:val="7"/>
+    <w:lvlOverride w:ilvl="0">
+      <w:startOverride w:val="1"/>
+    </w:lvlOverride>
+  </w:num>
+  <w:num w:numId="14">
     <w:abstractNumId w:val="7"/>
     <w:lvlOverride w:ilvl="0">
       <w:startOverride w:val="1"/>

</xml_diff>

<commit_message>
Proposal: compare Qwen3-VL-32B-Instruct adoption against other VLM families
Replace the within-family download table with a cross-family comparison
(Gemma 3 27B, InternVL3-38B/78B, Mistral Small 3.1 24B, Llama 3.2 90B
Vision, GLM-4.5V) and drop the family-wide Hub repository counts.
Regenerated .docx.

Co-Authored-By: Claude Fable 5.1 <noreply@anthropic.com>
</commit_message>
<xml_diff>
--- a/qwen-vl-finetune/docs/proposal/MLPerf_Training_proposal_Qwen3-VL.docx
+++ b/qwen-vl-finetune/docs/proposal/MLPerf_Training_proposal_Qwen3-VL.docx
@@ -424,7 +424,7 @@
         <w:t>Adoption and ecosystem.</w:t>
       </w:r>
       <w:r>
-        <w:t xml:space="preserve"> Qwen3-VL is the most widely adopted open VLM family today, which matters for a benchmark that should reflect what the community actually trains and deploys:</w:t>
+        <w:t xml:space="preserve"> Among open-weight VLMs of comparable size, Qwen3-VL-32B-Instruct is the most downloaded despite being the most recent release — which matters for a benchmark that should reflect what the community actually trains and deploys (Hugging Face API, 2026-09):</w:t>
       </w:r>
     </w:p>
     <w:tbl>
@@ -434,28 +434,16 @@
         <w:tblLook w:firstColumn="1" w:firstRow="1" w:lastColumn="0" w:lastRow="0" w:noHBand="0" w:noVBand="1" w:val="04A0"/>
       </w:tblPr>
       <w:tblGrid>
-        <w:gridCol w:w="2340"/>
-        <w:gridCol w:w="2340"/>
-        <w:gridCol w:w="2340"/>
-        <w:gridCol w:w="2340"/>
+        <w:gridCol w:w="1872"/>
+        <w:gridCol w:w="1872"/>
+        <w:gridCol w:w="1872"/>
+        <w:gridCol w:w="1872"/>
+        <w:gridCol w:w="1872"/>
       </w:tblGrid>
       <w:tr>
         <w:tc>
           <w:tcPr>
-            <w:tcW w:type="dxa" w:w="2340"/>
-          </w:tcPr>
-          <w:p>
-            <w:r>
-              <w:rPr>
-                <w:b/>
-                <w:sz w:val="18"/>
-              </w:rPr>
-            </w:r>
-          </w:p>
-        </w:tc>
-        <w:tc>
-          <w:tcPr>
-            <w:tcW w:type="dxa" w:w="2340"/>
+            <w:tcW w:type="dxa" w:w="1872"/>
           </w:tcPr>
           <w:p>
             <w:r>
@@ -469,18 +457,99 @@
                 <w:b/>
                 <w:sz w:val="18"/>
               </w:rPr>
-              <w:t>Qwen3-VL-8B-Instruct</w:t>
+              <w:t>Model</w:t>
             </w:r>
           </w:p>
         </w:tc>
         <w:tc>
           <w:tcPr>
-            <w:tcW w:type="dxa" w:w="2340"/>
+            <w:tcW w:type="dxa" w:w="1872"/>
           </w:tcPr>
           <w:p>
             <w:r>
               <w:rPr>
                 <w:b/>
+                <w:sz w:val="18"/>
+              </w:rPr>
+            </w:r>
+            <w:r>
+              <w:rPr>
+                <w:b/>
+                <w:sz w:val="18"/>
+              </w:rPr>
+              <w:t>Released</w:t>
+            </w:r>
+          </w:p>
+        </w:tc>
+        <w:tc>
+          <w:tcPr>
+            <w:tcW w:type="dxa" w:w="1872"/>
+          </w:tcPr>
+          <w:p>
+            <w:r>
+              <w:rPr>
+                <w:b/>
+                <w:sz w:val="18"/>
+              </w:rPr>
+            </w:r>
+            <w:r>
+              <w:rPr>
+                <w:b/>
+                <w:sz w:val="18"/>
+              </w:rPr>
+              <w:t>Params</w:t>
+            </w:r>
+          </w:p>
+        </w:tc>
+        <w:tc>
+          <w:tcPr>
+            <w:tcW w:type="dxa" w:w="1872"/>
+          </w:tcPr>
+          <w:p>
+            <w:r>
+              <w:rPr>
+                <w:b/>
+                <w:sz w:val="18"/>
+              </w:rPr>
+            </w:r>
+            <w:r>
+              <w:rPr>
+                <w:b/>
+                <w:sz w:val="18"/>
+              </w:rPr>
+              <w:t>Downloads, all time</w:t>
+            </w:r>
+          </w:p>
+        </w:tc>
+        <w:tc>
+          <w:tcPr>
+            <w:tcW w:type="dxa" w:w="1872"/>
+          </w:tcPr>
+          <w:p>
+            <w:r>
+              <w:rPr>
+                <w:b/>
+                <w:sz w:val="18"/>
+              </w:rPr>
+            </w:r>
+            <w:r>
+              <w:rPr>
+                <w:b/>
+                <w:sz w:val="18"/>
+              </w:rPr>
+              <w:t>Downloads, last 30 days</w:t>
+            </w:r>
+          </w:p>
+        </w:tc>
+      </w:tr>
+      <w:tr>
+        <w:tc>
+          <w:tcPr>
+            <w:tcW w:type="dxa" w:w="1872"/>
+          </w:tcPr>
+          <w:p>
+            <w:r>
+              <w:rPr>
                 <w:sz w:val="18"/>
               </w:rPr>
             </w:r>
@@ -495,47 +564,7 @@
         </w:tc>
         <w:tc>
           <w:tcPr>
-            <w:tcW w:type="dxa" w:w="2340"/>
-          </w:tcPr>
-          <w:p>
-            <w:r>
-              <w:rPr>
-                <w:b/>
-                <w:sz w:val="18"/>
-              </w:rPr>
-            </w:r>
-            <w:r>
-              <w:rPr>
-                <w:b/>
-                <w:sz w:val="18"/>
-              </w:rPr>
-              <w:t>Qwen3-VL-235B-A22B-Instruct</w:t>
-            </w:r>
-          </w:p>
-        </w:tc>
-      </w:tr>
-      <w:tr>
-        <w:tc>
-          <w:tcPr>
-            <w:tcW w:type="dxa" w:w="2340"/>
-          </w:tcPr>
-          <w:p>
-            <w:r>
-              <w:rPr>
-                <w:sz w:val="18"/>
-              </w:rPr>
-            </w:r>
-            <w:r>
-              <w:rPr>
-                <w:sz w:val="18"/>
-              </w:rPr>
-              <w:t>Released</w:t>
-            </w:r>
-          </w:p>
-        </w:tc>
-        <w:tc>
-          <w:tcPr>
-            <w:tcW w:type="dxa" w:w="2340"/>
+            <w:tcW w:type="dxa" w:w="1872"/>
           </w:tcPr>
           <w:p>
             <w:r>
@@ -553,7 +582,7 @@
         </w:tc>
         <w:tc>
           <w:tcPr>
-            <w:tcW w:type="dxa" w:w="2340"/>
+            <w:tcW w:type="dxa" w:w="1872"/>
           </w:tcPr>
           <w:p>
             <w:r>
@@ -565,13 +594,53 @@
               <w:rPr>
                 <w:sz w:val="18"/>
               </w:rPr>
-              <w:t>2025-10</w:t>
+              <w:t>33.4B</w:t>
             </w:r>
           </w:p>
         </w:tc>
         <w:tc>
           <w:tcPr>
-            <w:tcW w:type="dxa" w:w="2340"/>
+            <w:tcW w:type="dxa" w:w="1872"/>
+          </w:tcPr>
+          <w:p>
+            <w:r>
+              <w:rPr>
+                <w:sz w:val="18"/>
+              </w:rPr>
+            </w:r>
+            <w:r>
+              <w:rPr>
+                <w:b/>
+                <w:sz w:val="18"/>
+              </w:rPr>
+              <w:t>17.1M</w:t>
+            </w:r>
+          </w:p>
+        </w:tc>
+        <w:tc>
+          <w:tcPr>
+            <w:tcW w:type="dxa" w:w="1872"/>
+          </w:tcPr>
+          <w:p>
+            <w:r>
+              <w:rPr>
+                <w:sz w:val="18"/>
+              </w:rPr>
+            </w:r>
+            <w:r>
+              <w:rPr>
+                <w:b/>
+                <w:sz w:val="18"/>
+              </w:rPr>
+              <w:t>401k</w:t>
+            </w:r>
+          </w:p>
+        </w:tc>
+      </w:tr>
+      <w:tr>
+        <w:tc>
+          <w:tcPr>
+            <w:tcW w:type="dxa" w:w="1872"/>
           </w:tcPr>
           <w:p>
             <w:r>
@@ -583,15 +652,13 @@
               <w:rPr>
                 <w:sz w:val="18"/>
               </w:rPr>
-              <w:t>2025-09</w:t>
+              <w:t>Gemma 3 27B (it)</w:t>
             </w:r>
           </w:p>
         </w:tc>
-      </w:tr>
-      <w:tr>
         <w:tc>
           <w:tcPr>
-            <w:tcW w:type="dxa" w:w="2340"/>
+            <w:tcW w:type="dxa" w:w="1872"/>
           </w:tcPr>
           <w:p>
             <w:r>
@@ -603,13 +670,13 @@
               <w:rPr>
                 <w:sz w:val="18"/>
               </w:rPr>
-              <w:t>Hugging Face downloads, all time</w:t>
+              <w:t>2025-03</w:t>
             </w:r>
           </w:p>
         </w:tc>
         <w:tc>
           <w:tcPr>
-            <w:tcW w:type="dxa" w:w="2340"/>
+            <w:tcW w:type="dxa" w:w="1872"/>
           </w:tcPr>
           <w:p>
             <w:r>
@@ -621,13 +688,13 @@
               <w:rPr>
                 <w:sz w:val="18"/>
               </w:rPr>
-              <w:t>61.7M</w:t>
+              <w:t>27.4B</w:t>
             </w:r>
           </w:p>
         </w:tc>
         <w:tc>
           <w:tcPr>
-            <w:tcW w:type="dxa" w:w="2340"/>
+            <w:tcW w:type="dxa" w:w="1872"/>
           </w:tcPr>
           <w:p>
             <w:r>
@@ -639,13 +706,13 @@
               <w:rPr>
                 <w:sz w:val="18"/>
               </w:rPr>
-              <w:t>17.1M</w:t>
+              <w:t>16.9M</w:t>
             </w:r>
           </w:p>
         </w:tc>
         <w:tc>
           <w:tcPr>
-            <w:tcW w:type="dxa" w:w="2340"/>
+            <w:tcW w:type="dxa" w:w="1872"/>
           </w:tcPr>
           <w:p>
             <w:r>
@@ -657,7 +724,7 @@
               <w:rPr>
                 <w:sz w:val="18"/>
               </w:rPr>
-              <w:t>9.3M</w:t>
+              <w:t>371k</w:t>
             </w:r>
           </w:p>
         </w:tc>
@@ -665,7 +732,7 @@
       <w:tr>
         <w:tc>
           <w:tcPr>
-            <w:tcW w:type="dxa" w:w="2340"/>
+            <w:tcW w:type="dxa" w:w="1872"/>
           </w:tcPr>
           <w:p>
             <w:r>
@@ -677,13 +744,13 @@
               <w:rPr>
                 <w:sz w:val="18"/>
               </w:rPr>
-              <w:t>Hugging Face downloads, last 30 days</w:t>
+              <w:t>InternVL3-78B</w:t>
             </w:r>
           </w:p>
         </w:tc>
         <w:tc>
           <w:tcPr>
-            <w:tcW w:type="dxa" w:w="2340"/>
+            <w:tcW w:type="dxa" w:w="1872"/>
           </w:tcPr>
           <w:p>
             <w:r>
@@ -695,13 +762,13 @@
               <w:rPr>
                 <w:sz w:val="18"/>
               </w:rPr>
-              <w:t>15.2M</w:t>
+              <w:t>2025-04</w:t>
             </w:r>
           </w:p>
         </w:tc>
         <w:tc>
           <w:tcPr>
-            <w:tcW w:type="dxa" w:w="2340"/>
+            <w:tcW w:type="dxa" w:w="1872"/>
           </w:tcPr>
           <w:p>
             <w:r>
@@ -713,13 +780,13 @@
               <w:rPr>
                 <w:sz w:val="18"/>
               </w:rPr>
-              <w:t>0.4M</w:t>
+              <w:t>78.4B</w:t>
             </w:r>
           </w:p>
         </w:tc>
         <w:tc>
           <w:tcPr>
-            <w:tcW w:type="dxa" w:w="2340"/>
+            <w:tcW w:type="dxa" w:w="1872"/>
           </w:tcPr>
           <w:p>
             <w:r>
@@ -731,7 +798,393 @@
               <w:rPr>
                 <w:sz w:val="18"/>
               </w:rPr>
-              <w:t>0.5M</w:t>
+              <w:t>6.4M</w:t>
+            </w:r>
+          </w:p>
+        </w:tc>
+        <w:tc>
+          <w:tcPr>
+            <w:tcW w:type="dxa" w:w="1872"/>
+          </w:tcPr>
+          <w:p>
+            <w:r>
+              <w:rPr>
+                <w:sz w:val="18"/>
+              </w:rPr>
+            </w:r>
+            <w:r>
+              <w:rPr>
+                <w:sz w:val="18"/>
+              </w:rPr>
+              <w:t>14k</w:t>
+            </w:r>
+          </w:p>
+        </w:tc>
+      </w:tr>
+      <w:tr>
+        <w:tc>
+          <w:tcPr>
+            <w:tcW w:type="dxa" w:w="1872"/>
+          </w:tcPr>
+          <w:p>
+            <w:r>
+              <w:rPr>
+                <w:sz w:val="18"/>
+              </w:rPr>
+            </w:r>
+            <w:r>
+              <w:rPr>
+                <w:sz w:val="18"/>
+              </w:rPr>
+              <w:t>Mistral Small 3.1 24B Instruct</w:t>
+            </w:r>
+          </w:p>
+        </w:tc>
+        <w:tc>
+          <w:tcPr>
+            <w:tcW w:type="dxa" w:w="1872"/>
+          </w:tcPr>
+          <w:p>
+            <w:r>
+              <w:rPr>
+                <w:sz w:val="18"/>
+              </w:rPr>
+            </w:r>
+            <w:r>
+              <w:rPr>
+                <w:sz w:val="18"/>
+              </w:rPr>
+              <w:t>2025-03</w:t>
+            </w:r>
+          </w:p>
+        </w:tc>
+        <w:tc>
+          <w:tcPr>
+            <w:tcW w:type="dxa" w:w="1872"/>
+          </w:tcPr>
+          <w:p>
+            <w:r>
+              <w:rPr>
+                <w:sz w:val="18"/>
+              </w:rPr>
+            </w:r>
+            <w:r>
+              <w:rPr>
+                <w:sz w:val="18"/>
+              </w:rPr>
+              <w:t>24.0B</w:t>
+            </w:r>
+          </w:p>
+        </w:tc>
+        <w:tc>
+          <w:tcPr>
+            <w:tcW w:type="dxa" w:w="1872"/>
+          </w:tcPr>
+          <w:p>
+            <w:r>
+              <w:rPr>
+                <w:sz w:val="18"/>
+              </w:rPr>
+            </w:r>
+            <w:r>
+              <w:rPr>
+                <w:sz w:val="18"/>
+              </w:rPr>
+              <w:t>4.1M</w:t>
+            </w:r>
+          </w:p>
+        </w:tc>
+        <w:tc>
+          <w:tcPr>
+            <w:tcW w:type="dxa" w:w="1872"/>
+          </w:tcPr>
+          <w:p>
+            <w:r>
+              <w:rPr>
+                <w:sz w:val="18"/>
+              </w:rPr>
+            </w:r>
+            <w:r>
+              <w:rPr>
+                <w:sz w:val="18"/>
+              </w:rPr>
+              <w:t>241k</w:t>
+            </w:r>
+          </w:p>
+        </w:tc>
+      </w:tr>
+      <w:tr>
+        <w:tc>
+          <w:tcPr>
+            <w:tcW w:type="dxa" w:w="1872"/>
+          </w:tcPr>
+          <w:p>
+            <w:r>
+              <w:rPr>
+                <w:sz w:val="18"/>
+              </w:rPr>
+            </w:r>
+            <w:r>
+              <w:rPr>
+                <w:sz w:val="18"/>
+              </w:rPr>
+              <w:t>InternVL3-38B</w:t>
+            </w:r>
+          </w:p>
+        </w:tc>
+        <w:tc>
+          <w:tcPr>
+            <w:tcW w:type="dxa" w:w="1872"/>
+          </w:tcPr>
+          <w:p>
+            <w:r>
+              <w:rPr>
+                <w:sz w:val="18"/>
+              </w:rPr>
+            </w:r>
+            <w:r>
+              <w:rPr>
+                <w:sz w:val="18"/>
+              </w:rPr>
+              <w:t>2025-04</w:t>
+            </w:r>
+          </w:p>
+        </w:tc>
+        <w:tc>
+          <w:tcPr>
+            <w:tcW w:type="dxa" w:w="1872"/>
+          </w:tcPr>
+          <w:p>
+            <w:r>
+              <w:rPr>
+                <w:sz w:val="18"/>
+              </w:rPr>
+            </w:r>
+            <w:r>
+              <w:rPr>
+                <w:sz w:val="18"/>
+              </w:rPr>
+              <w:t>38.4B</w:t>
+            </w:r>
+          </w:p>
+        </w:tc>
+        <w:tc>
+          <w:tcPr>
+            <w:tcW w:type="dxa" w:w="1872"/>
+          </w:tcPr>
+          <w:p>
+            <w:r>
+              <w:rPr>
+                <w:sz w:val="18"/>
+              </w:rPr>
+            </w:r>
+            <w:r>
+              <w:rPr>
+                <w:sz w:val="18"/>
+              </w:rPr>
+              <w:t>1.3M</w:t>
+            </w:r>
+          </w:p>
+        </w:tc>
+        <w:tc>
+          <w:tcPr>
+            <w:tcW w:type="dxa" w:w="1872"/>
+          </w:tcPr>
+          <w:p>
+            <w:r>
+              <w:rPr>
+                <w:sz w:val="18"/>
+              </w:rPr>
+            </w:r>
+            <w:r>
+              <w:rPr>
+                <w:sz w:val="18"/>
+              </w:rPr>
+              <w:t>2k</w:t>
+            </w:r>
+          </w:p>
+        </w:tc>
+      </w:tr>
+      <w:tr>
+        <w:tc>
+          <w:tcPr>
+            <w:tcW w:type="dxa" w:w="1872"/>
+          </w:tcPr>
+          <w:p>
+            <w:r>
+              <w:rPr>
+                <w:sz w:val="18"/>
+              </w:rPr>
+            </w:r>
+            <w:r>
+              <w:rPr>
+                <w:sz w:val="18"/>
+              </w:rPr>
+              <w:t>Llama 3.2 90B Vision Instruct</w:t>
+            </w:r>
+          </w:p>
+        </w:tc>
+        <w:tc>
+          <w:tcPr>
+            <w:tcW w:type="dxa" w:w="1872"/>
+          </w:tcPr>
+          <w:p>
+            <w:r>
+              <w:rPr>
+                <w:sz w:val="18"/>
+              </w:rPr>
+            </w:r>
+            <w:r>
+              <w:rPr>
+                <w:sz w:val="18"/>
+              </w:rPr>
+              <w:t>2024-09</w:t>
+            </w:r>
+          </w:p>
+        </w:tc>
+        <w:tc>
+          <w:tcPr>
+            <w:tcW w:type="dxa" w:w="1872"/>
+          </w:tcPr>
+          <w:p>
+            <w:r>
+              <w:rPr>
+                <w:sz w:val="18"/>
+              </w:rPr>
+            </w:r>
+            <w:r>
+              <w:rPr>
+                <w:sz w:val="18"/>
+              </w:rPr>
+              <w:t>88.6B</w:t>
+            </w:r>
+          </w:p>
+        </w:tc>
+        <w:tc>
+          <w:tcPr>
+            <w:tcW w:type="dxa" w:w="1872"/>
+          </w:tcPr>
+          <w:p>
+            <w:r>
+              <w:rPr>
+                <w:sz w:val="18"/>
+              </w:rPr>
+            </w:r>
+            <w:r>
+              <w:rPr>
+                <w:sz w:val="18"/>
+              </w:rPr>
+              <w:t>1.0M</w:t>
+            </w:r>
+          </w:p>
+        </w:tc>
+        <w:tc>
+          <w:tcPr>
+            <w:tcW w:type="dxa" w:w="1872"/>
+          </w:tcPr>
+          <w:p>
+            <w:r>
+              <w:rPr>
+                <w:sz w:val="18"/>
+              </w:rPr>
+            </w:r>
+            <w:r>
+              <w:rPr>
+                <w:sz w:val="18"/>
+              </w:rPr>
+              <w:t>152k</w:t>
+            </w:r>
+          </w:p>
+        </w:tc>
+      </w:tr>
+      <w:tr>
+        <w:tc>
+          <w:tcPr>
+            <w:tcW w:type="dxa" w:w="1872"/>
+          </w:tcPr>
+          <w:p>
+            <w:r>
+              <w:rPr>
+                <w:sz w:val="18"/>
+              </w:rPr>
+            </w:r>
+            <w:r>
+              <w:rPr>
+                <w:sz w:val="18"/>
+              </w:rPr>
+              <w:t>GLM-4.5V (MoE)</w:t>
+            </w:r>
+          </w:p>
+        </w:tc>
+        <w:tc>
+          <w:tcPr>
+            <w:tcW w:type="dxa" w:w="1872"/>
+          </w:tcPr>
+          <w:p>
+            <w:r>
+              <w:rPr>
+                <w:sz w:val="18"/>
+              </w:rPr>
+            </w:r>
+            <w:r>
+              <w:rPr>
+                <w:sz w:val="18"/>
+              </w:rPr>
+              <w:t>2025-08</w:t>
+            </w:r>
+          </w:p>
+        </w:tc>
+        <w:tc>
+          <w:tcPr>
+            <w:tcW w:type="dxa" w:w="1872"/>
+          </w:tcPr>
+          <w:p>
+            <w:r>
+              <w:rPr>
+                <w:sz w:val="18"/>
+              </w:rPr>
+            </w:r>
+            <w:r>
+              <w:rPr>
+                <w:sz w:val="18"/>
+              </w:rPr>
+              <w:t>107.7B</w:t>
+            </w:r>
+          </w:p>
+        </w:tc>
+        <w:tc>
+          <w:tcPr>
+            <w:tcW w:type="dxa" w:w="1872"/>
+          </w:tcPr>
+          <w:p>
+            <w:r>
+              <w:rPr>
+                <w:sz w:val="18"/>
+              </w:rPr>
+            </w:r>
+            <w:r>
+              <w:rPr>
+                <w:sz w:val="18"/>
+              </w:rPr>
+              <w:t>1.0M</w:t>
+            </w:r>
+          </w:p>
+        </w:tc>
+        <w:tc>
+          <w:tcPr>
+            <w:tcW w:type="dxa" w:w="1872"/>
+          </w:tcPr>
+          <w:p>
+            <w:r>
+              <w:rPr>
+                <w:sz w:val="18"/>
+              </w:rPr>
+            </w:r>
+            <w:r>
+              <w:rPr>
+                <w:sz w:val="18"/>
+              </w:rPr>
+              <w:t>47k</w:t>
             </w:r>
           </w:p>
         </w:tc>
@@ -740,7 +1193,7 @@
     <w:p/>
     <w:p>
       <w:r>
-        <w:t xml:space="preserve">Hub repositories carrying the family name (fine-tunes, quantizations, merges): ~5,700 for Qwen3-VL vs. ~3,600 for its predecessor Qwen2.5-VL, ~860 for InternVL3 and ~440 for Llama-3.2-11B-Vision (Hugging Face API, 2026-09). The architecture is a native </w:t>
+        <w:t xml:space="preserve">The architecture is a native </w:t>
       </w:r>
       <w:r>
         <w:rPr>

</xml_diff>

<commit_message>
Proposal: 20-40B adoption table with derivative counts, dated "as of"
Restrict the comparison to 20-40B open VLMs (Gemma 3 27B, Mistral Small
3.1/3.2 24B, InternVL3/3.5-38B, Ovis2-34B, Aya Vision 32B), add Hub
derivative counts (fine-tunes, adapters, quantized) and date the table
"as of 2026-09-09". Regenerated .docx.

Co-Authored-By: Claude Fable 5.1 <noreply@anthropic.com>
</commit_message>
<xml_diff>
--- a/qwen-vl-finetune/docs/proposal/MLPerf_Training_proposal_Qwen3-VL.docx
+++ b/qwen-vl-finetune/docs/proposal/MLPerf_Training_proposal_Qwen3-VL.docx
@@ -424,7 +424,7 @@
         <w:t>Adoption and ecosystem.</w:t>
       </w:r>
       <w:r>
-        <w:t xml:space="preserve"> Among open-weight VLMs of comparable size, Qwen3-VL-32B-Instruct is the most downloaded despite being the most recent release — which matters for a benchmark that should reflect what the community actually trains and deploys (Hugging Face API, 2026-09):</w:t>
+        <w:t xml:space="preserve"> Among open-weight VLMs in the 20–40B class, Qwen3-VL-32B-Instruct is the most downloaded despite being among the most recent releases, and it has a substantial derivative ecosystem — which matters for a benchmark that should reflect what the community actually trains and deploys. As of 2026-09-09 (Hugging Face API; "derivatives" are Hub repositories declaring the model as their base):</w:t>
       </w:r>
     </w:p>
     <w:tbl>
@@ -434,16 +434,19 @@
         <w:tblLook w:firstColumn="1" w:firstRow="1" w:lastColumn="0" w:lastRow="0" w:noHBand="0" w:noVBand="1" w:val="04A0"/>
       </w:tblPr>
       <w:tblGrid>
-        <w:gridCol w:w="1872"/>
-        <w:gridCol w:w="1872"/>
-        <w:gridCol w:w="1872"/>
-        <w:gridCol w:w="1872"/>
-        <w:gridCol w:w="1872"/>
+        <w:gridCol w:w="1170"/>
+        <w:gridCol w:w="1170"/>
+        <w:gridCol w:w="1170"/>
+        <w:gridCol w:w="1170"/>
+        <w:gridCol w:w="1170"/>
+        <w:gridCol w:w="1170"/>
+        <w:gridCol w:w="1170"/>
+        <w:gridCol w:w="1170"/>
       </w:tblGrid>
       <w:tr>
         <w:tc>
           <w:tcPr>
-            <w:tcW w:type="dxa" w:w="1872"/>
+            <w:tcW w:type="dxa" w:w="1170"/>
           </w:tcPr>
           <w:p>
             <w:r>
@@ -463,7 +466,7 @@
         </w:tc>
         <w:tc>
           <w:tcPr>
-            <w:tcW w:type="dxa" w:w="1872"/>
+            <w:tcW w:type="dxa" w:w="1170"/>
           </w:tcPr>
           <w:p>
             <w:r>
@@ -483,7 +486,7 @@
         </w:tc>
         <w:tc>
           <w:tcPr>
-            <w:tcW w:type="dxa" w:w="1872"/>
+            <w:tcW w:type="dxa" w:w="1170"/>
           </w:tcPr>
           <w:p>
             <w:r>
@@ -503,7 +506,7 @@
         </w:tc>
         <w:tc>
           <w:tcPr>
-            <w:tcW w:type="dxa" w:w="1872"/>
+            <w:tcW w:type="dxa" w:w="1170"/>
           </w:tcPr>
           <w:p>
             <w:r>
@@ -523,7 +526,7 @@
         </w:tc>
         <w:tc>
           <w:tcPr>
-            <w:tcW w:type="dxa" w:w="1872"/>
+            <w:tcW w:type="dxa" w:w="1170"/>
           </w:tcPr>
           <w:p>
             <w:r>
@@ -541,11 +544,71 @@
             </w:r>
           </w:p>
         </w:tc>
+        <w:tc>
+          <w:tcPr>
+            <w:tcW w:type="dxa" w:w="1170"/>
+          </w:tcPr>
+          <w:p>
+            <w:r>
+              <w:rPr>
+                <w:b/>
+                <w:sz w:val="18"/>
+              </w:rPr>
+            </w:r>
+            <w:r>
+              <w:rPr>
+                <w:b/>
+                <w:sz w:val="18"/>
+              </w:rPr>
+              <w:t>Fine-tunes</w:t>
+            </w:r>
+          </w:p>
+        </w:tc>
+        <w:tc>
+          <w:tcPr>
+            <w:tcW w:type="dxa" w:w="1170"/>
+          </w:tcPr>
+          <w:p>
+            <w:r>
+              <w:rPr>
+                <w:b/>
+                <w:sz w:val="18"/>
+              </w:rPr>
+            </w:r>
+            <w:r>
+              <w:rPr>
+                <w:b/>
+                <w:sz w:val="18"/>
+              </w:rPr>
+              <w:t>Adapters</w:t>
+            </w:r>
+          </w:p>
+        </w:tc>
+        <w:tc>
+          <w:tcPr>
+            <w:tcW w:type="dxa" w:w="1170"/>
+          </w:tcPr>
+          <w:p>
+            <w:r>
+              <w:rPr>
+                <w:b/>
+                <w:sz w:val="18"/>
+              </w:rPr>
+            </w:r>
+            <w:r>
+              <w:rPr>
+                <w:b/>
+                <w:sz w:val="18"/>
+              </w:rPr>
+              <w:t>Quantized</w:t>
+            </w:r>
+          </w:p>
+        </w:tc>
       </w:tr>
       <w:tr>
         <w:tc>
           <w:tcPr>
-            <w:tcW w:type="dxa" w:w="1872"/>
+            <w:tcW w:type="dxa" w:w="1170"/>
           </w:tcPr>
           <w:p>
             <w:r>
@@ -564,7 +627,7 @@
         </w:tc>
         <w:tc>
           <w:tcPr>
-            <w:tcW w:type="dxa" w:w="1872"/>
+            <w:tcW w:type="dxa" w:w="1170"/>
           </w:tcPr>
           <w:p>
             <w:r>
@@ -582,7 +645,7 @@
         </w:tc>
         <w:tc>
           <w:tcPr>
-            <w:tcW w:type="dxa" w:w="1872"/>
+            <w:tcW w:type="dxa" w:w="1170"/>
           </w:tcPr>
           <w:p>
             <w:r>
@@ -600,7 +663,7 @@
         </w:tc>
         <w:tc>
           <w:tcPr>
-            <w:tcW w:type="dxa" w:w="1872"/>
+            <w:tcW w:type="dxa" w:w="1170"/>
           </w:tcPr>
           <w:p>
             <w:r>
@@ -619,7 +682,7 @@
         </w:tc>
         <w:tc>
           <w:tcPr>
-            <w:tcW w:type="dxa" w:w="1872"/>
+            <w:tcW w:type="dxa" w:w="1170"/>
           </w:tcPr>
           <w:p>
             <w:r>
@@ -636,11 +699,65 @@
             </w:r>
           </w:p>
         </w:tc>
+        <w:tc>
+          <w:tcPr>
+            <w:tcW w:type="dxa" w:w="1170"/>
+          </w:tcPr>
+          <w:p>
+            <w:r>
+              <w:rPr>
+                <w:sz w:val="18"/>
+              </w:rPr>
+            </w:r>
+            <w:r>
+              <w:rPr>
+                <w:sz w:val="18"/>
+              </w:rPr>
+              <w:t>65</w:t>
+            </w:r>
+          </w:p>
+        </w:tc>
+        <w:tc>
+          <w:tcPr>
+            <w:tcW w:type="dxa" w:w="1170"/>
+          </w:tcPr>
+          <w:p>
+            <w:r>
+              <w:rPr>
+                <w:sz w:val="18"/>
+              </w:rPr>
+            </w:r>
+            <w:r>
+              <w:rPr>
+                <w:sz w:val="18"/>
+              </w:rPr>
+              <w:t>15</w:t>
+            </w:r>
+          </w:p>
+        </w:tc>
+        <w:tc>
+          <w:tcPr>
+            <w:tcW w:type="dxa" w:w="1170"/>
+          </w:tcPr>
+          <w:p>
+            <w:r>
+              <w:rPr>
+                <w:sz w:val="18"/>
+              </w:rPr>
+            </w:r>
+            <w:r>
+              <w:rPr>
+                <w:sz w:val="18"/>
+              </w:rPr>
+              <w:t>49</w:t>
+            </w:r>
+          </w:p>
+        </w:tc>
       </w:tr>
       <w:tr>
         <w:tc>
           <w:tcPr>
-            <w:tcW w:type="dxa" w:w="1872"/>
+            <w:tcW w:type="dxa" w:w="1170"/>
           </w:tcPr>
           <w:p>
             <w:r>
@@ -658,7 +775,7 @@
         </w:tc>
         <w:tc>
           <w:tcPr>
-            <w:tcW w:type="dxa" w:w="1872"/>
+            <w:tcW w:type="dxa" w:w="1170"/>
           </w:tcPr>
           <w:p>
             <w:r>
@@ -676,7 +793,7 @@
         </w:tc>
         <w:tc>
           <w:tcPr>
-            <w:tcW w:type="dxa" w:w="1872"/>
+            <w:tcW w:type="dxa" w:w="1170"/>
           </w:tcPr>
           <w:p>
             <w:r>
@@ -694,7 +811,7 @@
         </w:tc>
         <w:tc>
           <w:tcPr>
-            <w:tcW w:type="dxa" w:w="1872"/>
+            <w:tcW w:type="dxa" w:w="1170"/>
           </w:tcPr>
           <w:p>
             <w:r>
@@ -712,7 +829,7 @@
         </w:tc>
         <w:tc>
           <w:tcPr>
-            <w:tcW w:type="dxa" w:w="1872"/>
+            <w:tcW w:type="dxa" w:w="1170"/>
           </w:tcPr>
           <w:p>
             <w:r>
@@ -728,11 +845,9 @@
             </w:r>
           </w:p>
         </w:tc>
-      </w:tr>
-      <w:tr>
         <w:tc>
           <w:tcPr>
-            <w:tcW w:type="dxa" w:w="1872"/>
+            <w:tcW w:type="dxa" w:w="1170"/>
           </w:tcPr>
           <w:p>
             <w:r>
@@ -744,13 +859,361 @@
               <w:rPr>
                 <w:sz w:val="18"/>
               </w:rPr>
-              <w:t>InternVL3-78B</w:t>
+              <w:t>448</w:t>
             </w:r>
           </w:p>
         </w:tc>
         <w:tc>
           <w:tcPr>
-            <w:tcW w:type="dxa" w:w="1872"/>
+            <w:tcW w:type="dxa" w:w="1170"/>
+          </w:tcPr>
+          <w:p>
+            <w:r>
+              <w:rPr>
+                <w:sz w:val="18"/>
+              </w:rPr>
+            </w:r>
+            <w:r>
+              <w:rPr>
+                <w:sz w:val="18"/>
+              </w:rPr>
+              <w:t>259</w:t>
+            </w:r>
+          </w:p>
+        </w:tc>
+        <w:tc>
+          <w:tcPr>
+            <w:tcW w:type="dxa" w:w="1170"/>
+          </w:tcPr>
+          <w:p>
+            <w:r>
+              <w:rPr>
+                <w:sz w:val="18"/>
+              </w:rPr>
+            </w:r>
+            <w:r>
+              <w:rPr>
+                <w:sz w:val="18"/>
+              </w:rPr>
+              <w:t>144</w:t>
+            </w:r>
+          </w:p>
+        </w:tc>
+      </w:tr>
+      <w:tr>
+        <w:tc>
+          <w:tcPr>
+            <w:tcW w:type="dxa" w:w="1170"/>
+          </w:tcPr>
+          <w:p>
+            <w:r>
+              <w:rPr>
+                <w:sz w:val="18"/>
+              </w:rPr>
+            </w:r>
+            <w:r>
+              <w:rPr>
+                <w:sz w:val="18"/>
+              </w:rPr>
+              <w:t>Mistral Small 3.2 24B Instruct</w:t>
+            </w:r>
+          </w:p>
+        </w:tc>
+        <w:tc>
+          <w:tcPr>
+            <w:tcW w:type="dxa" w:w="1170"/>
+          </w:tcPr>
+          <w:p>
+            <w:r>
+              <w:rPr>
+                <w:sz w:val="18"/>
+              </w:rPr>
+            </w:r>
+            <w:r>
+              <w:rPr>
+                <w:sz w:val="18"/>
+              </w:rPr>
+              <w:t>2025-06</w:t>
+            </w:r>
+          </w:p>
+        </w:tc>
+        <w:tc>
+          <w:tcPr>
+            <w:tcW w:type="dxa" w:w="1170"/>
+          </w:tcPr>
+          <w:p>
+            <w:r>
+              <w:rPr>
+                <w:sz w:val="18"/>
+              </w:rPr>
+            </w:r>
+            <w:r>
+              <w:rPr>
+                <w:sz w:val="18"/>
+              </w:rPr>
+              <w:t>24.0B</w:t>
+            </w:r>
+          </w:p>
+        </w:tc>
+        <w:tc>
+          <w:tcPr>
+            <w:tcW w:type="dxa" w:w="1170"/>
+          </w:tcPr>
+          <w:p>
+            <w:r>
+              <w:rPr>
+                <w:sz w:val="18"/>
+              </w:rPr>
+            </w:r>
+            <w:r>
+              <w:rPr>
+                <w:sz w:val="18"/>
+              </w:rPr>
+              <w:t>5.2M</w:t>
+            </w:r>
+          </w:p>
+        </w:tc>
+        <w:tc>
+          <w:tcPr>
+            <w:tcW w:type="dxa" w:w="1170"/>
+          </w:tcPr>
+          <w:p>
+            <w:r>
+              <w:rPr>
+                <w:sz w:val="18"/>
+              </w:rPr>
+            </w:r>
+            <w:r>
+              <w:rPr>
+                <w:sz w:val="18"/>
+              </w:rPr>
+              <w:t>128k</w:t>
+            </w:r>
+          </w:p>
+        </w:tc>
+        <w:tc>
+          <w:tcPr>
+            <w:tcW w:type="dxa" w:w="1170"/>
+          </w:tcPr>
+          <w:p>
+            <w:r>
+              <w:rPr>
+                <w:sz w:val="18"/>
+              </w:rPr>
+            </w:r>
+            <w:r>
+              <w:rPr>
+                <w:sz w:val="18"/>
+              </w:rPr>
+              <w:t>65</w:t>
+            </w:r>
+          </w:p>
+        </w:tc>
+        <w:tc>
+          <w:tcPr>
+            <w:tcW w:type="dxa" w:w="1170"/>
+          </w:tcPr>
+          <w:p>
+            <w:r>
+              <w:rPr>
+                <w:sz w:val="18"/>
+              </w:rPr>
+            </w:r>
+            <w:r>
+              <w:rPr>
+                <w:sz w:val="18"/>
+              </w:rPr>
+              <w:t>15</w:t>
+            </w:r>
+          </w:p>
+        </w:tc>
+        <w:tc>
+          <w:tcPr>
+            <w:tcW w:type="dxa" w:w="1170"/>
+          </w:tcPr>
+          <w:p>
+            <w:r>
+              <w:rPr>
+                <w:sz w:val="18"/>
+              </w:rPr>
+            </w:r>
+            <w:r>
+              <w:rPr>
+                <w:sz w:val="18"/>
+              </w:rPr>
+              <w:t>69</w:t>
+            </w:r>
+          </w:p>
+        </w:tc>
+      </w:tr>
+      <w:tr>
+        <w:tc>
+          <w:tcPr>
+            <w:tcW w:type="dxa" w:w="1170"/>
+          </w:tcPr>
+          <w:p>
+            <w:r>
+              <w:rPr>
+                <w:sz w:val="18"/>
+              </w:rPr>
+            </w:r>
+            <w:r>
+              <w:rPr>
+                <w:sz w:val="18"/>
+              </w:rPr>
+              <w:t>Mistral Small 3.1 24B Instruct</w:t>
+            </w:r>
+          </w:p>
+        </w:tc>
+        <w:tc>
+          <w:tcPr>
+            <w:tcW w:type="dxa" w:w="1170"/>
+          </w:tcPr>
+          <w:p>
+            <w:r>
+              <w:rPr>
+                <w:sz w:val="18"/>
+              </w:rPr>
+            </w:r>
+            <w:r>
+              <w:rPr>
+                <w:sz w:val="18"/>
+              </w:rPr>
+              <w:t>2025-03</w:t>
+            </w:r>
+          </w:p>
+        </w:tc>
+        <w:tc>
+          <w:tcPr>
+            <w:tcW w:type="dxa" w:w="1170"/>
+          </w:tcPr>
+          <w:p>
+            <w:r>
+              <w:rPr>
+                <w:sz w:val="18"/>
+              </w:rPr>
+            </w:r>
+            <w:r>
+              <w:rPr>
+                <w:sz w:val="18"/>
+              </w:rPr>
+              <w:t>24.0B</w:t>
+            </w:r>
+          </w:p>
+        </w:tc>
+        <w:tc>
+          <w:tcPr>
+            <w:tcW w:type="dxa" w:w="1170"/>
+          </w:tcPr>
+          <w:p>
+            <w:r>
+              <w:rPr>
+                <w:sz w:val="18"/>
+              </w:rPr>
+            </w:r>
+            <w:r>
+              <w:rPr>
+                <w:sz w:val="18"/>
+              </w:rPr>
+              <w:t>4.1M</w:t>
+            </w:r>
+          </w:p>
+        </w:tc>
+        <w:tc>
+          <w:tcPr>
+            <w:tcW w:type="dxa" w:w="1170"/>
+          </w:tcPr>
+          <w:p>
+            <w:r>
+              <w:rPr>
+                <w:sz w:val="18"/>
+              </w:rPr>
+            </w:r>
+            <w:r>
+              <w:rPr>
+                <w:sz w:val="18"/>
+              </w:rPr>
+              <w:t>241k</w:t>
+            </w:r>
+          </w:p>
+        </w:tc>
+        <w:tc>
+          <w:tcPr>
+            <w:tcW w:type="dxa" w:w="1170"/>
+          </w:tcPr>
+          <w:p>
+            <w:r>
+              <w:rPr>
+                <w:sz w:val="18"/>
+              </w:rPr>
+            </w:r>
+            <w:r>
+              <w:rPr>
+                <w:sz w:val="18"/>
+              </w:rPr>
+              <w:t>58</w:t>
+            </w:r>
+          </w:p>
+        </w:tc>
+        <w:tc>
+          <w:tcPr>
+            <w:tcW w:type="dxa" w:w="1170"/>
+          </w:tcPr>
+          <w:p>
+            <w:r>
+              <w:rPr>
+                <w:sz w:val="18"/>
+              </w:rPr>
+            </w:r>
+            <w:r>
+              <w:rPr>
+                <w:sz w:val="18"/>
+              </w:rPr>
+              <w:t>12</w:t>
+            </w:r>
+          </w:p>
+        </w:tc>
+        <w:tc>
+          <w:tcPr>
+            <w:tcW w:type="dxa" w:w="1170"/>
+          </w:tcPr>
+          <w:p>
+            <w:r>
+              <w:rPr>
+                <w:sz w:val="18"/>
+              </w:rPr>
+            </w:r>
+            <w:r>
+              <w:rPr>
+                <w:sz w:val="18"/>
+              </w:rPr>
+              <w:t>64</w:t>
+            </w:r>
+          </w:p>
+        </w:tc>
+      </w:tr>
+      <w:tr>
+        <w:tc>
+          <w:tcPr>
+            <w:tcW w:type="dxa" w:w="1170"/>
+          </w:tcPr>
+          <w:p>
+            <w:r>
+              <w:rPr>
+                <w:sz w:val="18"/>
+              </w:rPr>
+            </w:r>
+            <w:r>
+              <w:rPr>
+                <w:sz w:val="18"/>
+              </w:rPr>
+              <w:t>InternVL3-38B</w:t>
+            </w:r>
+          </w:p>
+        </w:tc>
+        <w:tc>
+          <w:tcPr>
+            <w:tcW w:type="dxa" w:w="1170"/>
           </w:tcPr>
           <w:p>
             <w:r>
@@ -768,7 +1231,7 @@
         </w:tc>
         <w:tc>
           <w:tcPr>
-            <w:tcW w:type="dxa" w:w="1872"/>
+            <w:tcW w:type="dxa" w:w="1170"/>
           </w:tcPr>
           <w:p>
             <w:r>
@@ -780,13 +1243,13 @@
               <w:rPr>
                 <w:sz w:val="18"/>
               </w:rPr>
-              <w:t>78.4B</w:t>
+              <w:t>38.4B</w:t>
             </w:r>
           </w:p>
         </w:tc>
         <w:tc>
           <w:tcPr>
-            <w:tcW w:type="dxa" w:w="1872"/>
+            <w:tcW w:type="dxa" w:w="1170"/>
           </w:tcPr>
           <w:p>
             <w:r>
@@ -798,13 +1261,13 @@
               <w:rPr>
                 <w:sz w:val="18"/>
               </w:rPr>
-              <w:t>6.4M</w:t>
+              <w:t>1.3M</w:t>
             </w:r>
           </w:p>
         </w:tc>
         <w:tc>
           <w:tcPr>
-            <w:tcW w:type="dxa" w:w="1872"/>
+            <w:tcW w:type="dxa" w:w="1170"/>
           </w:tcPr>
           <w:p>
             <w:r>
@@ -816,15 +1279,13 @@
               <w:rPr>
                 <w:sz w:val="18"/>
               </w:rPr>
-              <w:t>14k</w:t>
+              <w:t>2k</w:t>
             </w:r>
           </w:p>
         </w:tc>
-      </w:tr>
-      <w:tr>
         <w:tc>
           <w:tcPr>
-            <w:tcW w:type="dxa" w:w="1872"/>
+            <w:tcW w:type="dxa" w:w="1170"/>
           </w:tcPr>
           <w:p>
             <w:r>
@@ -836,13 +1297,361 @@
               <w:rPr>
                 <w:sz w:val="18"/>
               </w:rPr>
-              <w:t>Mistral Small 3.1 24B Instruct</w:t>
+              <w:t>6</w:t>
             </w:r>
           </w:p>
         </w:tc>
         <w:tc>
           <w:tcPr>
-            <w:tcW w:type="dxa" w:w="1872"/>
+            <w:tcW w:type="dxa" w:w="1170"/>
+          </w:tcPr>
+          <w:p>
+            <w:r>
+              <w:rPr>
+                <w:sz w:val="18"/>
+              </w:rPr>
+            </w:r>
+            <w:r>
+              <w:rPr>
+                <w:sz w:val="18"/>
+              </w:rPr>
+              <w:t>0</w:t>
+            </w:r>
+          </w:p>
+        </w:tc>
+        <w:tc>
+          <w:tcPr>
+            <w:tcW w:type="dxa" w:w="1170"/>
+          </w:tcPr>
+          <w:p>
+            <w:r>
+              <w:rPr>
+                <w:sz w:val="18"/>
+              </w:rPr>
+            </w:r>
+            <w:r>
+              <w:rPr>
+                <w:sz w:val="18"/>
+              </w:rPr>
+              <w:t>3</w:t>
+            </w:r>
+          </w:p>
+        </w:tc>
+      </w:tr>
+      <w:tr>
+        <w:tc>
+          <w:tcPr>
+            <w:tcW w:type="dxa" w:w="1170"/>
+          </w:tcPr>
+          <w:p>
+            <w:r>
+              <w:rPr>
+                <w:sz w:val="18"/>
+              </w:rPr>
+            </w:r>
+            <w:r>
+              <w:rPr>
+                <w:sz w:val="18"/>
+              </w:rPr>
+              <w:t>InternVL3.5-38B</w:t>
+            </w:r>
+          </w:p>
+        </w:tc>
+        <w:tc>
+          <w:tcPr>
+            <w:tcW w:type="dxa" w:w="1170"/>
+          </w:tcPr>
+          <w:p>
+            <w:r>
+              <w:rPr>
+                <w:sz w:val="18"/>
+              </w:rPr>
+            </w:r>
+            <w:r>
+              <w:rPr>
+                <w:sz w:val="18"/>
+              </w:rPr>
+              <w:t>2025-08</w:t>
+            </w:r>
+          </w:p>
+        </w:tc>
+        <w:tc>
+          <w:tcPr>
+            <w:tcW w:type="dxa" w:w="1170"/>
+          </w:tcPr>
+          <w:p>
+            <w:r>
+              <w:rPr>
+                <w:sz w:val="18"/>
+              </w:rPr>
+            </w:r>
+            <w:r>
+              <w:rPr>
+                <w:sz w:val="18"/>
+              </w:rPr>
+              <w:t>38.4B</w:t>
+            </w:r>
+          </w:p>
+        </w:tc>
+        <w:tc>
+          <w:tcPr>
+            <w:tcW w:type="dxa" w:w="1170"/>
+          </w:tcPr>
+          <w:p>
+            <w:r>
+              <w:rPr>
+                <w:sz w:val="18"/>
+              </w:rPr>
+            </w:r>
+            <w:r>
+              <w:rPr>
+                <w:sz w:val="18"/>
+              </w:rPr>
+              <w:t>0.3M</w:t>
+            </w:r>
+          </w:p>
+        </w:tc>
+        <w:tc>
+          <w:tcPr>
+            <w:tcW w:type="dxa" w:w="1170"/>
+          </w:tcPr>
+          <w:p>
+            <w:r>
+              <w:rPr>
+                <w:sz w:val="18"/>
+              </w:rPr>
+            </w:r>
+            <w:r>
+              <w:rPr>
+                <w:sz w:val="18"/>
+              </w:rPr>
+              <w:t>20k</w:t>
+            </w:r>
+          </w:p>
+        </w:tc>
+        <w:tc>
+          <w:tcPr>
+            <w:tcW w:type="dxa" w:w="1170"/>
+          </w:tcPr>
+          <w:p>
+            <w:r>
+              <w:rPr>
+                <w:sz w:val="18"/>
+              </w:rPr>
+            </w:r>
+            <w:r>
+              <w:rPr>
+                <w:sz w:val="18"/>
+              </w:rPr>
+              <w:t>6</w:t>
+            </w:r>
+          </w:p>
+        </w:tc>
+        <w:tc>
+          <w:tcPr>
+            <w:tcW w:type="dxa" w:w="1170"/>
+          </w:tcPr>
+          <w:p>
+            <w:r>
+              <w:rPr>
+                <w:sz w:val="18"/>
+              </w:rPr>
+            </w:r>
+            <w:r>
+              <w:rPr>
+                <w:sz w:val="18"/>
+              </w:rPr>
+              <w:t>0</w:t>
+            </w:r>
+          </w:p>
+        </w:tc>
+        <w:tc>
+          <w:tcPr>
+            <w:tcW w:type="dxa" w:w="1170"/>
+          </w:tcPr>
+          <w:p>
+            <w:r>
+              <w:rPr>
+                <w:sz w:val="18"/>
+              </w:rPr>
+            </w:r>
+            <w:r>
+              <w:rPr>
+                <w:sz w:val="18"/>
+              </w:rPr>
+              <w:t>7</w:t>
+            </w:r>
+          </w:p>
+        </w:tc>
+      </w:tr>
+      <w:tr>
+        <w:tc>
+          <w:tcPr>
+            <w:tcW w:type="dxa" w:w="1170"/>
+          </w:tcPr>
+          <w:p>
+            <w:r>
+              <w:rPr>
+                <w:sz w:val="18"/>
+              </w:rPr>
+            </w:r>
+            <w:r>
+              <w:rPr>
+                <w:sz w:val="18"/>
+              </w:rPr>
+              <w:t>Ovis2-34B</w:t>
+            </w:r>
+          </w:p>
+        </w:tc>
+        <w:tc>
+          <w:tcPr>
+            <w:tcW w:type="dxa" w:w="1170"/>
+          </w:tcPr>
+          <w:p>
+            <w:r>
+              <w:rPr>
+                <w:sz w:val="18"/>
+              </w:rPr>
+            </w:r>
+            <w:r>
+              <w:rPr>
+                <w:sz w:val="18"/>
+              </w:rPr>
+              <w:t>2025-02</w:t>
+            </w:r>
+          </w:p>
+        </w:tc>
+        <w:tc>
+          <w:tcPr>
+            <w:tcW w:type="dxa" w:w="1170"/>
+          </w:tcPr>
+          <w:p>
+            <w:r>
+              <w:rPr>
+                <w:sz w:val="18"/>
+              </w:rPr>
+            </w:r>
+            <w:r>
+              <w:rPr>
+                <w:sz w:val="18"/>
+              </w:rPr>
+              <w:t>34.9B</w:t>
+            </w:r>
+          </w:p>
+        </w:tc>
+        <w:tc>
+          <w:tcPr>
+            <w:tcW w:type="dxa" w:w="1170"/>
+          </w:tcPr>
+          <w:p>
+            <w:r>
+              <w:rPr>
+                <w:sz w:val="18"/>
+              </w:rPr>
+            </w:r>
+            <w:r>
+              <w:rPr>
+                <w:sz w:val="18"/>
+              </w:rPr>
+              <w:t>0.1M</w:t>
+            </w:r>
+          </w:p>
+        </w:tc>
+        <w:tc>
+          <w:tcPr>
+            <w:tcW w:type="dxa" w:w="1170"/>
+          </w:tcPr>
+          <w:p>
+            <w:r>
+              <w:rPr>
+                <w:sz w:val="18"/>
+              </w:rPr>
+            </w:r>
+            <w:r>
+              <w:rPr>
+                <w:sz w:val="18"/>
+              </w:rPr>
+              <w:t>0.2k</w:t>
+            </w:r>
+          </w:p>
+        </w:tc>
+        <w:tc>
+          <w:tcPr>
+            <w:tcW w:type="dxa" w:w="1170"/>
+          </w:tcPr>
+          <w:p>
+            <w:r>
+              <w:rPr>
+                <w:sz w:val="18"/>
+              </w:rPr>
+            </w:r>
+            <w:r>
+              <w:rPr>
+                <w:sz w:val="18"/>
+              </w:rPr>
+              <w:t>0</w:t>
+            </w:r>
+          </w:p>
+        </w:tc>
+        <w:tc>
+          <w:tcPr>
+            <w:tcW w:type="dxa" w:w="1170"/>
+          </w:tcPr>
+          <w:p>
+            <w:r>
+              <w:rPr>
+                <w:sz w:val="18"/>
+              </w:rPr>
+            </w:r>
+            <w:r>
+              <w:rPr>
+                <w:sz w:val="18"/>
+              </w:rPr>
+              <w:t>0</w:t>
+            </w:r>
+          </w:p>
+        </w:tc>
+        <w:tc>
+          <w:tcPr>
+            <w:tcW w:type="dxa" w:w="1170"/>
+          </w:tcPr>
+          <w:p>
+            <w:r>
+              <w:rPr>
+                <w:sz w:val="18"/>
+              </w:rPr>
+            </w:r>
+            <w:r>
+              <w:rPr>
+                <w:sz w:val="18"/>
+              </w:rPr>
+              <w:t>0</w:t>
+            </w:r>
+          </w:p>
+        </w:tc>
+      </w:tr>
+      <w:tr>
+        <w:tc>
+          <w:tcPr>
+            <w:tcW w:type="dxa" w:w="1170"/>
+          </w:tcPr>
+          <w:p>
+            <w:r>
+              <w:rPr>
+                <w:sz w:val="18"/>
+              </w:rPr>
+            </w:r>
+            <w:r>
+              <w:rPr>
+                <w:sz w:val="18"/>
+              </w:rPr>
+              <w:t>Aya Vision 32B</w:t>
+            </w:r>
+          </w:p>
+        </w:tc>
+        <w:tc>
+          <w:tcPr>
+            <w:tcW w:type="dxa" w:w="1170"/>
           </w:tcPr>
           <w:p>
             <w:r>
@@ -860,7 +1669,7 @@
         </w:tc>
         <w:tc>
           <w:tcPr>
-            <w:tcW w:type="dxa" w:w="1872"/>
+            <w:tcW w:type="dxa" w:w="1170"/>
           </w:tcPr>
           <w:p>
             <w:r>
@@ -872,13 +1681,13 @@
               <w:rPr>
                 <w:sz w:val="18"/>
               </w:rPr>
-              <w:t>24.0B</w:t>
+              <w:t>33.1B</w:t>
             </w:r>
           </w:p>
         </w:tc>
         <w:tc>
           <w:tcPr>
-            <w:tcW w:type="dxa" w:w="1872"/>
+            <w:tcW w:type="dxa" w:w="1170"/>
           </w:tcPr>
           <w:p>
             <w:r>
@@ -890,13 +1699,13 @@
               <w:rPr>
                 <w:sz w:val="18"/>
               </w:rPr>
-              <w:t>4.1M</w:t>
+              <w:t>6.5k</w:t>
             </w:r>
           </w:p>
         </w:tc>
         <w:tc>
           <w:tcPr>
-            <w:tcW w:type="dxa" w:w="1872"/>
+            <w:tcW w:type="dxa" w:w="1170"/>
           </w:tcPr>
           <w:p>
             <w:r>
@@ -908,15 +1717,13 @@
               <w:rPr>
                 <w:sz w:val="18"/>
               </w:rPr>
-              <w:t>241k</w:t>
+              <w:t>0.5k</w:t>
             </w:r>
           </w:p>
         </w:tc>
-      </w:tr>
-      <w:tr>
         <w:tc>
           <w:tcPr>
-            <w:tcW w:type="dxa" w:w="1872"/>
+            <w:tcW w:type="dxa" w:w="1170"/>
           </w:tcPr>
           <w:p>
             <w:r>
@@ -928,13 +1735,13 @@
               <w:rPr>
                 <w:sz w:val="18"/>
               </w:rPr>
-              <w:t>InternVL3-38B</w:t>
+              <w:t>1</w:t>
             </w:r>
           </w:p>
         </w:tc>
         <w:tc>
           <w:tcPr>
-            <w:tcW w:type="dxa" w:w="1872"/>
+            <w:tcW w:type="dxa" w:w="1170"/>
           </w:tcPr>
           <w:p>
             <w:r>
@@ -946,13 +1753,13 @@
               <w:rPr>
                 <w:sz w:val="18"/>
               </w:rPr>
-              <w:t>2025-04</w:t>
+              <w:t>3</w:t>
             </w:r>
           </w:p>
         </w:tc>
         <w:tc>
           <w:tcPr>
-            <w:tcW w:type="dxa" w:w="1872"/>
+            <w:tcW w:type="dxa" w:w="1170"/>
           </w:tcPr>
           <w:p>
             <w:r>
@@ -964,233 +1771,18 @@
               <w:rPr>
                 <w:sz w:val="18"/>
               </w:rPr>
-              <w:t>38.4B</w:t>
-            </w:r>
-          </w:p>
-        </w:tc>
-        <w:tc>
-          <w:tcPr>
-            <w:tcW w:type="dxa" w:w="1872"/>
-          </w:tcPr>
-          <w:p>
-            <w:r>
-              <w:rPr>
-                <w:sz w:val="18"/>
-              </w:rPr>
-            </w:r>
-            <w:r>
-              <w:rPr>
-                <w:sz w:val="18"/>
-              </w:rPr>
-              <w:t>1.3M</w:t>
-            </w:r>
-          </w:p>
-        </w:tc>
-        <w:tc>
-          <w:tcPr>
-            <w:tcW w:type="dxa" w:w="1872"/>
-          </w:tcPr>
-          <w:p>
-            <w:r>
-              <w:rPr>
-                <w:sz w:val="18"/>
-              </w:rPr>
-            </w:r>
-            <w:r>
-              <w:rPr>
-                <w:sz w:val="18"/>
-              </w:rPr>
-              <w:t>2k</w:t>
-            </w:r>
-          </w:p>
-        </w:tc>
-      </w:tr>
-      <w:tr>
-        <w:tc>
-          <w:tcPr>
-            <w:tcW w:type="dxa" w:w="1872"/>
-          </w:tcPr>
-          <w:p>
-            <w:r>
-              <w:rPr>
-                <w:sz w:val="18"/>
-              </w:rPr>
-            </w:r>
-            <w:r>
-              <w:rPr>
-                <w:sz w:val="18"/>
-              </w:rPr>
-              <w:t>Llama 3.2 90B Vision Instruct</w:t>
-            </w:r>
-          </w:p>
-        </w:tc>
-        <w:tc>
-          <w:tcPr>
-            <w:tcW w:type="dxa" w:w="1872"/>
-          </w:tcPr>
-          <w:p>
-            <w:r>
-              <w:rPr>
-                <w:sz w:val="18"/>
-              </w:rPr>
-            </w:r>
-            <w:r>
-              <w:rPr>
-                <w:sz w:val="18"/>
-              </w:rPr>
-              <w:t>2024-09</w:t>
-            </w:r>
-          </w:p>
-        </w:tc>
-        <w:tc>
-          <w:tcPr>
-            <w:tcW w:type="dxa" w:w="1872"/>
-          </w:tcPr>
-          <w:p>
-            <w:r>
-              <w:rPr>
-                <w:sz w:val="18"/>
-              </w:rPr>
-            </w:r>
-            <w:r>
-              <w:rPr>
-                <w:sz w:val="18"/>
-              </w:rPr>
-              <w:t>88.6B</w:t>
-            </w:r>
-          </w:p>
-        </w:tc>
-        <w:tc>
-          <w:tcPr>
-            <w:tcW w:type="dxa" w:w="1872"/>
-          </w:tcPr>
-          <w:p>
-            <w:r>
-              <w:rPr>
-                <w:sz w:val="18"/>
-              </w:rPr>
-            </w:r>
-            <w:r>
-              <w:rPr>
-                <w:sz w:val="18"/>
-              </w:rPr>
-              <w:t>1.0M</w:t>
-            </w:r>
-          </w:p>
-        </w:tc>
-        <w:tc>
-          <w:tcPr>
-            <w:tcW w:type="dxa" w:w="1872"/>
-          </w:tcPr>
-          <w:p>
-            <w:r>
-              <w:rPr>
-                <w:sz w:val="18"/>
-              </w:rPr>
-            </w:r>
-            <w:r>
-              <w:rPr>
-                <w:sz w:val="18"/>
-              </w:rPr>
-              <w:t>152k</w:t>
-            </w:r>
-          </w:p>
-        </w:tc>
-      </w:tr>
-      <w:tr>
-        <w:tc>
-          <w:tcPr>
-            <w:tcW w:type="dxa" w:w="1872"/>
-          </w:tcPr>
-          <w:p>
-            <w:r>
-              <w:rPr>
-                <w:sz w:val="18"/>
-              </w:rPr>
-            </w:r>
-            <w:r>
-              <w:rPr>
-                <w:sz w:val="18"/>
-              </w:rPr>
-              <w:t>GLM-4.5V (MoE)</w:t>
-            </w:r>
-          </w:p>
-        </w:tc>
-        <w:tc>
-          <w:tcPr>
-            <w:tcW w:type="dxa" w:w="1872"/>
-          </w:tcPr>
-          <w:p>
-            <w:r>
-              <w:rPr>
-                <w:sz w:val="18"/>
-              </w:rPr>
-            </w:r>
-            <w:r>
-              <w:rPr>
-                <w:sz w:val="18"/>
-              </w:rPr>
-              <w:t>2025-08</w:t>
-            </w:r>
-          </w:p>
-        </w:tc>
-        <w:tc>
-          <w:tcPr>
-            <w:tcW w:type="dxa" w:w="1872"/>
-          </w:tcPr>
-          <w:p>
-            <w:r>
-              <w:rPr>
-                <w:sz w:val="18"/>
-              </w:rPr>
-            </w:r>
-            <w:r>
-              <w:rPr>
-                <w:sz w:val="18"/>
-              </w:rPr>
-              <w:t>107.7B</w:t>
-            </w:r>
-          </w:p>
-        </w:tc>
-        <w:tc>
-          <w:tcPr>
-            <w:tcW w:type="dxa" w:w="1872"/>
-          </w:tcPr>
-          <w:p>
-            <w:r>
-              <w:rPr>
-                <w:sz w:val="18"/>
-              </w:rPr>
-            </w:r>
-            <w:r>
-              <w:rPr>
-                <w:sz w:val="18"/>
-              </w:rPr>
-              <w:t>1.0M</w:t>
-            </w:r>
-          </w:p>
-        </w:tc>
-        <w:tc>
-          <w:tcPr>
-            <w:tcW w:type="dxa" w:w="1872"/>
-          </w:tcPr>
-          <w:p>
-            <w:r>
-              <w:rPr>
-                <w:sz w:val="18"/>
-              </w:rPr>
-            </w:r>
-            <w:r>
-              <w:rPr>
-                <w:sz w:val="18"/>
-              </w:rPr>
-              <w:t>47k</w:t>
+              <w:t>2</w:t>
             </w:r>
           </w:p>
         </w:tc>
       </w:tr>
     </w:tbl>
     <w:p/>
+    <w:p>
+      <w:r>
+        <w:t>Gemma 3 27B — seven months older and widely used as a text-only model as well — has the larger derivative tree; Qwen3-VL-32B matches the Mistral Small line in derivatives and leads every dedicated VLM in its class (InternVL3 / 3.5, Ovis2, Aya Vision) by one to two orders of magnitude on both downloads and derivatives. It is also the only model in the table with a documented multi-stage multimodal pretraining recipe.</w:t>
+      </w:r>
+    </w:p>
     <w:p>
       <w:r>
         <w:t xml:space="preserve">The architecture is a native </w:t>

</xml_diff>

<commit_message>
Proposal: split adoption data into two tables; smarter docx column widths
Downloads and derivatives are now separate 5- and 4-column tables that
render without mid-word header breaks. md_to_docx.py sizes columns from
the rendered width of each column's longest word (with proportional
sharing of the remainder), sets grid column widths so LibreOffice/Docs
honor them, keeps table rows on one page, and uses 0.75in margins.

Co-Authored-By: Claude Fable 5.1 <noreply@anthropic.com>
</commit_message>
<xml_diff>
--- a/qwen-vl-finetune/docs/proposal/MLPerf_Training_proposal_Qwen3-VL.docx
+++ b/qwen-vl-finetune/docs/proposal/MLPerf_Training_proposal_Qwen3-VL.docx
@@ -431,22 +431,23 @@
       <w:tblPr>
         <w:tblStyle w:val="TableGrid"/>
         <w:tblW w:type="auto" w:w="0"/>
+        <w:tblLayout w:type="fixed"/>
         <w:tblLook w:firstColumn="1" w:firstRow="1" w:lastColumn="0" w:lastRow="0" w:noHBand="0" w:noVBand="1" w:val="04A0"/>
       </w:tblPr>
       <w:tblGrid>
-        <w:gridCol w:w="1170"/>
-        <w:gridCol w:w="1170"/>
-        <w:gridCol w:w="1170"/>
-        <w:gridCol w:w="1170"/>
-        <w:gridCol w:w="1170"/>
-        <w:gridCol w:w="1170"/>
-        <w:gridCol w:w="1170"/>
-        <w:gridCol w:w="1170"/>
+        <w:gridCol w:w="3443"/>
+        <w:gridCol w:w="1454"/>
+        <w:gridCol w:w="1148"/>
+        <w:gridCol w:w="1971"/>
+        <w:gridCol w:w="2064"/>
       </w:tblGrid>
       <w:tr>
+        <w:trPr>
+          <w:cantSplit/>
+        </w:trPr>
         <w:tc>
           <w:tcPr>
-            <w:tcW w:type="dxa" w:w="1170"/>
+            <w:tcW w:type="dxa" w:w="3443"/>
           </w:tcPr>
           <w:p>
             <w:r>
@@ -466,7 +467,7 @@
         </w:tc>
         <w:tc>
           <w:tcPr>
-            <w:tcW w:type="dxa" w:w="1170"/>
+            <w:tcW w:type="dxa" w:w="1454"/>
           </w:tcPr>
           <w:p>
             <w:r>
@@ -486,7 +487,7 @@
         </w:tc>
         <w:tc>
           <w:tcPr>
-            <w:tcW w:type="dxa" w:w="1170"/>
+            <w:tcW w:type="dxa" w:w="1148"/>
           </w:tcPr>
           <w:p>
             <w:r>
@@ -506,7 +507,7 @@
         </w:tc>
         <w:tc>
           <w:tcPr>
-            <w:tcW w:type="dxa" w:w="1170"/>
+            <w:tcW w:type="dxa" w:w="1971"/>
           </w:tcPr>
           <w:p>
             <w:r>
@@ -526,7 +527,7 @@
         </w:tc>
         <w:tc>
           <w:tcPr>
-            <w:tcW w:type="dxa" w:w="1170"/>
+            <w:tcW w:type="dxa" w:w="2064"/>
           </w:tcPr>
           <w:p>
             <w:r>
@@ -544,9 +545,817 @@
             </w:r>
           </w:p>
         </w:tc>
+      </w:tr>
+      <w:tr>
+        <w:trPr>
+          <w:cantSplit/>
+        </w:trPr>
         <w:tc>
           <w:tcPr>
-            <w:tcW w:type="dxa" w:w="1170"/>
+            <w:tcW w:type="dxa" w:w="3443"/>
+          </w:tcPr>
+          <w:p>
+            <w:r>
+              <w:rPr>
+                <w:sz w:val="18"/>
+              </w:rPr>
+            </w:r>
+            <w:r>
+              <w:rPr>
+                <w:b/>
+                <w:sz w:val="18"/>
+              </w:rPr>
+              <w:t>Qwen3-VL-32B-Instruct</w:t>
+            </w:r>
+          </w:p>
+        </w:tc>
+        <w:tc>
+          <w:tcPr>
+            <w:tcW w:type="dxa" w:w="1454"/>
+          </w:tcPr>
+          <w:p>
+            <w:r>
+              <w:rPr>
+                <w:sz w:val="18"/>
+              </w:rPr>
+            </w:r>
+            <w:r>
+              <w:rPr>
+                <w:sz w:val="18"/>
+              </w:rPr>
+              <w:t>2025-10</w:t>
+            </w:r>
+          </w:p>
+        </w:tc>
+        <w:tc>
+          <w:tcPr>
+            <w:tcW w:type="dxa" w:w="1148"/>
+          </w:tcPr>
+          <w:p>
+            <w:r>
+              <w:rPr>
+                <w:sz w:val="18"/>
+              </w:rPr>
+            </w:r>
+            <w:r>
+              <w:rPr>
+                <w:sz w:val="18"/>
+              </w:rPr>
+              <w:t>33.4B</w:t>
+            </w:r>
+          </w:p>
+        </w:tc>
+        <w:tc>
+          <w:tcPr>
+            <w:tcW w:type="dxa" w:w="1971"/>
+          </w:tcPr>
+          <w:p>
+            <w:r>
+              <w:rPr>
+                <w:sz w:val="18"/>
+              </w:rPr>
+            </w:r>
+            <w:r>
+              <w:rPr>
+                <w:b/>
+                <w:sz w:val="18"/>
+              </w:rPr>
+              <w:t>17.1M</w:t>
+            </w:r>
+          </w:p>
+        </w:tc>
+        <w:tc>
+          <w:tcPr>
+            <w:tcW w:type="dxa" w:w="2064"/>
+          </w:tcPr>
+          <w:p>
+            <w:r>
+              <w:rPr>
+                <w:sz w:val="18"/>
+              </w:rPr>
+            </w:r>
+            <w:r>
+              <w:rPr>
+                <w:b/>
+                <w:sz w:val="18"/>
+              </w:rPr>
+              <w:t>401k</w:t>
+            </w:r>
+          </w:p>
+        </w:tc>
+      </w:tr>
+      <w:tr>
+        <w:trPr>
+          <w:cantSplit/>
+        </w:trPr>
+        <w:tc>
+          <w:tcPr>
+            <w:tcW w:type="dxa" w:w="3443"/>
+          </w:tcPr>
+          <w:p>
+            <w:r>
+              <w:rPr>
+                <w:sz w:val="18"/>
+              </w:rPr>
+            </w:r>
+            <w:r>
+              <w:rPr>
+                <w:sz w:val="18"/>
+              </w:rPr>
+              <w:t>Gemma 3 27B (it)</w:t>
+            </w:r>
+          </w:p>
+        </w:tc>
+        <w:tc>
+          <w:tcPr>
+            <w:tcW w:type="dxa" w:w="1454"/>
+          </w:tcPr>
+          <w:p>
+            <w:r>
+              <w:rPr>
+                <w:sz w:val="18"/>
+              </w:rPr>
+            </w:r>
+            <w:r>
+              <w:rPr>
+                <w:sz w:val="18"/>
+              </w:rPr>
+              <w:t>2025-03</w:t>
+            </w:r>
+          </w:p>
+        </w:tc>
+        <w:tc>
+          <w:tcPr>
+            <w:tcW w:type="dxa" w:w="1148"/>
+          </w:tcPr>
+          <w:p>
+            <w:r>
+              <w:rPr>
+                <w:sz w:val="18"/>
+              </w:rPr>
+            </w:r>
+            <w:r>
+              <w:rPr>
+                <w:sz w:val="18"/>
+              </w:rPr>
+              <w:t>27.4B</w:t>
+            </w:r>
+          </w:p>
+        </w:tc>
+        <w:tc>
+          <w:tcPr>
+            <w:tcW w:type="dxa" w:w="1971"/>
+          </w:tcPr>
+          <w:p>
+            <w:r>
+              <w:rPr>
+                <w:sz w:val="18"/>
+              </w:rPr>
+            </w:r>
+            <w:r>
+              <w:rPr>
+                <w:sz w:val="18"/>
+              </w:rPr>
+              <w:t>16.9M</w:t>
+            </w:r>
+          </w:p>
+        </w:tc>
+        <w:tc>
+          <w:tcPr>
+            <w:tcW w:type="dxa" w:w="2064"/>
+          </w:tcPr>
+          <w:p>
+            <w:r>
+              <w:rPr>
+                <w:sz w:val="18"/>
+              </w:rPr>
+            </w:r>
+            <w:r>
+              <w:rPr>
+                <w:sz w:val="18"/>
+              </w:rPr>
+              <w:t>371k</w:t>
+            </w:r>
+          </w:p>
+        </w:tc>
+      </w:tr>
+      <w:tr>
+        <w:trPr>
+          <w:cantSplit/>
+        </w:trPr>
+        <w:tc>
+          <w:tcPr>
+            <w:tcW w:type="dxa" w:w="3443"/>
+          </w:tcPr>
+          <w:p>
+            <w:r>
+              <w:rPr>
+                <w:sz w:val="18"/>
+              </w:rPr>
+            </w:r>
+            <w:r>
+              <w:rPr>
+                <w:sz w:val="18"/>
+              </w:rPr>
+              <w:t>Mistral Small 3.2 24B</w:t>
+            </w:r>
+          </w:p>
+        </w:tc>
+        <w:tc>
+          <w:tcPr>
+            <w:tcW w:type="dxa" w:w="1454"/>
+          </w:tcPr>
+          <w:p>
+            <w:r>
+              <w:rPr>
+                <w:sz w:val="18"/>
+              </w:rPr>
+            </w:r>
+            <w:r>
+              <w:rPr>
+                <w:sz w:val="18"/>
+              </w:rPr>
+              <w:t>2025-06</w:t>
+            </w:r>
+          </w:p>
+        </w:tc>
+        <w:tc>
+          <w:tcPr>
+            <w:tcW w:type="dxa" w:w="1148"/>
+          </w:tcPr>
+          <w:p>
+            <w:r>
+              <w:rPr>
+                <w:sz w:val="18"/>
+              </w:rPr>
+            </w:r>
+            <w:r>
+              <w:rPr>
+                <w:sz w:val="18"/>
+              </w:rPr>
+              <w:t>24.0B</w:t>
+            </w:r>
+          </w:p>
+        </w:tc>
+        <w:tc>
+          <w:tcPr>
+            <w:tcW w:type="dxa" w:w="1971"/>
+          </w:tcPr>
+          <w:p>
+            <w:r>
+              <w:rPr>
+                <w:sz w:val="18"/>
+              </w:rPr>
+            </w:r>
+            <w:r>
+              <w:rPr>
+                <w:sz w:val="18"/>
+              </w:rPr>
+              <w:t>5.2M</w:t>
+            </w:r>
+          </w:p>
+        </w:tc>
+        <w:tc>
+          <w:tcPr>
+            <w:tcW w:type="dxa" w:w="2064"/>
+          </w:tcPr>
+          <w:p>
+            <w:r>
+              <w:rPr>
+                <w:sz w:val="18"/>
+              </w:rPr>
+            </w:r>
+            <w:r>
+              <w:rPr>
+                <w:sz w:val="18"/>
+              </w:rPr>
+              <w:t>128k</w:t>
+            </w:r>
+          </w:p>
+        </w:tc>
+      </w:tr>
+      <w:tr>
+        <w:trPr>
+          <w:cantSplit/>
+        </w:trPr>
+        <w:tc>
+          <w:tcPr>
+            <w:tcW w:type="dxa" w:w="3443"/>
+          </w:tcPr>
+          <w:p>
+            <w:r>
+              <w:rPr>
+                <w:sz w:val="18"/>
+              </w:rPr>
+            </w:r>
+            <w:r>
+              <w:rPr>
+                <w:sz w:val="18"/>
+              </w:rPr>
+              <w:t>Mistral Small 3.1 24B</w:t>
+            </w:r>
+          </w:p>
+        </w:tc>
+        <w:tc>
+          <w:tcPr>
+            <w:tcW w:type="dxa" w:w="1454"/>
+          </w:tcPr>
+          <w:p>
+            <w:r>
+              <w:rPr>
+                <w:sz w:val="18"/>
+              </w:rPr>
+            </w:r>
+            <w:r>
+              <w:rPr>
+                <w:sz w:val="18"/>
+              </w:rPr>
+              <w:t>2025-03</w:t>
+            </w:r>
+          </w:p>
+        </w:tc>
+        <w:tc>
+          <w:tcPr>
+            <w:tcW w:type="dxa" w:w="1148"/>
+          </w:tcPr>
+          <w:p>
+            <w:r>
+              <w:rPr>
+                <w:sz w:val="18"/>
+              </w:rPr>
+            </w:r>
+            <w:r>
+              <w:rPr>
+                <w:sz w:val="18"/>
+              </w:rPr>
+              <w:t>24.0B</w:t>
+            </w:r>
+          </w:p>
+        </w:tc>
+        <w:tc>
+          <w:tcPr>
+            <w:tcW w:type="dxa" w:w="1971"/>
+          </w:tcPr>
+          <w:p>
+            <w:r>
+              <w:rPr>
+                <w:sz w:val="18"/>
+              </w:rPr>
+            </w:r>
+            <w:r>
+              <w:rPr>
+                <w:sz w:val="18"/>
+              </w:rPr>
+              <w:t>4.1M</w:t>
+            </w:r>
+          </w:p>
+        </w:tc>
+        <w:tc>
+          <w:tcPr>
+            <w:tcW w:type="dxa" w:w="2064"/>
+          </w:tcPr>
+          <w:p>
+            <w:r>
+              <w:rPr>
+                <w:sz w:val="18"/>
+              </w:rPr>
+            </w:r>
+            <w:r>
+              <w:rPr>
+                <w:sz w:val="18"/>
+              </w:rPr>
+              <w:t>241k</w:t>
+            </w:r>
+          </w:p>
+        </w:tc>
+      </w:tr>
+      <w:tr>
+        <w:trPr>
+          <w:cantSplit/>
+        </w:trPr>
+        <w:tc>
+          <w:tcPr>
+            <w:tcW w:type="dxa" w:w="3443"/>
+          </w:tcPr>
+          <w:p>
+            <w:r>
+              <w:rPr>
+                <w:sz w:val="18"/>
+              </w:rPr>
+            </w:r>
+            <w:r>
+              <w:rPr>
+                <w:sz w:val="18"/>
+              </w:rPr>
+              <w:t>InternVL3-38B</w:t>
+            </w:r>
+          </w:p>
+        </w:tc>
+        <w:tc>
+          <w:tcPr>
+            <w:tcW w:type="dxa" w:w="1454"/>
+          </w:tcPr>
+          <w:p>
+            <w:r>
+              <w:rPr>
+                <w:sz w:val="18"/>
+              </w:rPr>
+            </w:r>
+            <w:r>
+              <w:rPr>
+                <w:sz w:val="18"/>
+              </w:rPr>
+              <w:t>2025-04</w:t>
+            </w:r>
+          </w:p>
+        </w:tc>
+        <w:tc>
+          <w:tcPr>
+            <w:tcW w:type="dxa" w:w="1148"/>
+          </w:tcPr>
+          <w:p>
+            <w:r>
+              <w:rPr>
+                <w:sz w:val="18"/>
+              </w:rPr>
+            </w:r>
+            <w:r>
+              <w:rPr>
+                <w:sz w:val="18"/>
+              </w:rPr>
+              <w:t>38.4B</w:t>
+            </w:r>
+          </w:p>
+        </w:tc>
+        <w:tc>
+          <w:tcPr>
+            <w:tcW w:type="dxa" w:w="1971"/>
+          </w:tcPr>
+          <w:p>
+            <w:r>
+              <w:rPr>
+                <w:sz w:val="18"/>
+              </w:rPr>
+            </w:r>
+            <w:r>
+              <w:rPr>
+                <w:sz w:val="18"/>
+              </w:rPr>
+              <w:t>1.3M</w:t>
+            </w:r>
+          </w:p>
+        </w:tc>
+        <w:tc>
+          <w:tcPr>
+            <w:tcW w:type="dxa" w:w="2064"/>
+          </w:tcPr>
+          <w:p>
+            <w:r>
+              <w:rPr>
+                <w:sz w:val="18"/>
+              </w:rPr>
+            </w:r>
+            <w:r>
+              <w:rPr>
+                <w:sz w:val="18"/>
+              </w:rPr>
+              <w:t>2k</w:t>
+            </w:r>
+          </w:p>
+        </w:tc>
+      </w:tr>
+      <w:tr>
+        <w:trPr>
+          <w:cantSplit/>
+        </w:trPr>
+        <w:tc>
+          <w:tcPr>
+            <w:tcW w:type="dxa" w:w="3443"/>
+          </w:tcPr>
+          <w:p>
+            <w:r>
+              <w:rPr>
+                <w:sz w:val="18"/>
+              </w:rPr>
+            </w:r>
+            <w:r>
+              <w:rPr>
+                <w:sz w:val="18"/>
+              </w:rPr>
+              <w:t>InternVL3.5-38B</w:t>
+            </w:r>
+          </w:p>
+        </w:tc>
+        <w:tc>
+          <w:tcPr>
+            <w:tcW w:type="dxa" w:w="1454"/>
+          </w:tcPr>
+          <w:p>
+            <w:r>
+              <w:rPr>
+                <w:sz w:val="18"/>
+              </w:rPr>
+            </w:r>
+            <w:r>
+              <w:rPr>
+                <w:sz w:val="18"/>
+              </w:rPr>
+              <w:t>2025-08</w:t>
+            </w:r>
+          </w:p>
+        </w:tc>
+        <w:tc>
+          <w:tcPr>
+            <w:tcW w:type="dxa" w:w="1148"/>
+          </w:tcPr>
+          <w:p>
+            <w:r>
+              <w:rPr>
+                <w:sz w:val="18"/>
+              </w:rPr>
+            </w:r>
+            <w:r>
+              <w:rPr>
+                <w:sz w:val="18"/>
+              </w:rPr>
+              <w:t>38.4B</w:t>
+            </w:r>
+          </w:p>
+        </w:tc>
+        <w:tc>
+          <w:tcPr>
+            <w:tcW w:type="dxa" w:w="1971"/>
+          </w:tcPr>
+          <w:p>
+            <w:r>
+              <w:rPr>
+                <w:sz w:val="18"/>
+              </w:rPr>
+            </w:r>
+            <w:r>
+              <w:rPr>
+                <w:sz w:val="18"/>
+              </w:rPr>
+              <w:t>0.3M</w:t>
+            </w:r>
+          </w:p>
+        </w:tc>
+        <w:tc>
+          <w:tcPr>
+            <w:tcW w:type="dxa" w:w="2064"/>
+          </w:tcPr>
+          <w:p>
+            <w:r>
+              <w:rPr>
+                <w:sz w:val="18"/>
+              </w:rPr>
+            </w:r>
+            <w:r>
+              <w:rPr>
+                <w:sz w:val="18"/>
+              </w:rPr>
+              <w:t>20k</w:t>
+            </w:r>
+          </w:p>
+        </w:tc>
+      </w:tr>
+      <w:tr>
+        <w:trPr>
+          <w:cantSplit/>
+        </w:trPr>
+        <w:tc>
+          <w:tcPr>
+            <w:tcW w:type="dxa" w:w="3443"/>
+          </w:tcPr>
+          <w:p>
+            <w:r>
+              <w:rPr>
+                <w:sz w:val="18"/>
+              </w:rPr>
+            </w:r>
+            <w:r>
+              <w:rPr>
+                <w:sz w:val="18"/>
+              </w:rPr>
+              <w:t>Ovis2-34B</w:t>
+            </w:r>
+          </w:p>
+        </w:tc>
+        <w:tc>
+          <w:tcPr>
+            <w:tcW w:type="dxa" w:w="1454"/>
+          </w:tcPr>
+          <w:p>
+            <w:r>
+              <w:rPr>
+                <w:sz w:val="18"/>
+              </w:rPr>
+            </w:r>
+            <w:r>
+              <w:rPr>
+                <w:sz w:val="18"/>
+              </w:rPr>
+              <w:t>2025-02</w:t>
+            </w:r>
+          </w:p>
+        </w:tc>
+        <w:tc>
+          <w:tcPr>
+            <w:tcW w:type="dxa" w:w="1148"/>
+          </w:tcPr>
+          <w:p>
+            <w:r>
+              <w:rPr>
+                <w:sz w:val="18"/>
+              </w:rPr>
+            </w:r>
+            <w:r>
+              <w:rPr>
+                <w:sz w:val="18"/>
+              </w:rPr>
+              <w:t>34.9B</w:t>
+            </w:r>
+          </w:p>
+        </w:tc>
+        <w:tc>
+          <w:tcPr>
+            <w:tcW w:type="dxa" w:w="1971"/>
+          </w:tcPr>
+          <w:p>
+            <w:r>
+              <w:rPr>
+                <w:sz w:val="18"/>
+              </w:rPr>
+            </w:r>
+            <w:r>
+              <w:rPr>
+                <w:sz w:val="18"/>
+              </w:rPr>
+              <w:t>0.1M</w:t>
+            </w:r>
+          </w:p>
+        </w:tc>
+        <w:tc>
+          <w:tcPr>
+            <w:tcW w:type="dxa" w:w="2064"/>
+          </w:tcPr>
+          <w:p>
+            <w:r>
+              <w:rPr>
+                <w:sz w:val="18"/>
+              </w:rPr>
+            </w:r>
+            <w:r>
+              <w:rPr>
+                <w:sz w:val="18"/>
+              </w:rPr>
+              <w:t>0.2k</w:t>
+            </w:r>
+          </w:p>
+        </w:tc>
+      </w:tr>
+      <w:tr>
+        <w:trPr>
+          <w:cantSplit/>
+        </w:trPr>
+        <w:tc>
+          <w:tcPr>
+            <w:tcW w:type="dxa" w:w="3443"/>
+          </w:tcPr>
+          <w:p>
+            <w:r>
+              <w:rPr>
+                <w:sz w:val="18"/>
+              </w:rPr>
+            </w:r>
+            <w:r>
+              <w:rPr>
+                <w:sz w:val="18"/>
+              </w:rPr>
+              <w:t>Aya Vision 32B</w:t>
+            </w:r>
+          </w:p>
+        </w:tc>
+        <w:tc>
+          <w:tcPr>
+            <w:tcW w:type="dxa" w:w="1454"/>
+          </w:tcPr>
+          <w:p>
+            <w:r>
+              <w:rPr>
+                <w:sz w:val="18"/>
+              </w:rPr>
+            </w:r>
+            <w:r>
+              <w:rPr>
+                <w:sz w:val="18"/>
+              </w:rPr>
+              <w:t>2025-03</w:t>
+            </w:r>
+          </w:p>
+        </w:tc>
+        <w:tc>
+          <w:tcPr>
+            <w:tcW w:type="dxa" w:w="1148"/>
+          </w:tcPr>
+          <w:p>
+            <w:r>
+              <w:rPr>
+                <w:sz w:val="18"/>
+              </w:rPr>
+            </w:r>
+            <w:r>
+              <w:rPr>
+                <w:sz w:val="18"/>
+              </w:rPr>
+              <w:t>33.1B</w:t>
+            </w:r>
+          </w:p>
+        </w:tc>
+        <w:tc>
+          <w:tcPr>
+            <w:tcW w:type="dxa" w:w="1971"/>
+          </w:tcPr>
+          <w:p>
+            <w:r>
+              <w:rPr>
+                <w:sz w:val="18"/>
+              </w:rPr>
+            </w:r>
+            <w:r>
+              <w:rPr>
+                <w:sz w:val="18"/>
+              </w:rPr>
+              <w:t>6.5k</w:t>
+            </w:r>
+          </w:p>
+        </w:tc>
+        <w:tc>
+          <w:tcPr>
+            <w:tcW w:type="dxa" w:w="2064"/>
+          </w:tcPr>
+          <w:p>
+            <w:r>
+              <w:rPr>
+                <w:sz w:val="18"/>
+              </w:rPr>
+            </w:r>
+            <w:r>
+              <w:rPr>
+                <w:sz w:val="18"/>
+              </w:rPr>
+              <w:t>0.5k</w:t>
+            </w:r>
+          </w:p>
+        </w:tc>
+      </w:tr>
+    </w:tbl>
+    <w:p/>
+    <w:p>
+      <w:r>
+        <w:t>Derivatives on the Hub, same date:</w:t>
+      </w:r>
+    </w:p>
+    <w:tbl>
+      <w:tblPr>
+        <w:tblStyle w:val="TableGrid"/>
+        <w:tblW w:type="auto" w:w="0"/>
+        <w:tblLayout w:type="fixed"/>
+        <w:tblLook w:firstColumn="1" w:firstRow="1" w:lastColumn="0" w:lastRow="0" w:noHBand="0" w:noVBand="1" w:val="04A0"/>
+      </w:tblPr>
+      <w:tblGrid>
+        <w:gridCol w:w="4034"/>
+        <w:gridCol w:w="2042"/>
+        <w:gridCol w:w="1679"/>
+        <w:gridCol w:w="2324"/>
+      </w:tblGrid>
+      <w:tr>
+        <w:trPr>
+          <w:cantSplit/>
+        </w:trPr>
+        <w:tc>
+          <w:tcPr>
+            <w:tcW w:type="dxa" w:w="4034"/>
+          </w:tcPr>
+          <w:p>
+            <w:r>
+              <w:rPr>
+                <w:b/>
+                <w:sz w:val="18"/>
+              </w:rPr>
+            </w:r>
+            <w:r>
+              <w:rPr>
+                <w:b/>
+                <w:sz w:val="18"/>
+              </w:rPr>
+              <w:t>Model</w:t>
+            </w:r>
+          </w:p>
+        </w:tc>
+        <w:tc>
+          <w:tcPr>
+            <w:tcW w:type="dxa" w:w="2042"/>
           </w:tcPr>
           <w:p>
             <w:r>
@@ -566,7 +1375,7 @@
         </w:tc>
         <w:tc>
           <w:tcPr>
-            <w:tcW w:type="dxa" w:w="1170"/>
+            <w:tcW w:type="dxa" w:w="1679"/>
           </w:tcPr>
           <w:p>
             <w:r>
@@ -586,7 +1395,7 @@
         </w:tc>
         <w:tc>
           <w:tcPr>
-            <w:tcW w:type="dxa" w:w="1170"/>
+            <w:tcW w:type="dxa" w:w="2324"/>
           </w:tcPr>
           <w:p>
             <w:r>
@@ -600,15 +1409,18 @@
                 <w:b/>
                 <w:sz w:val="18"/>
               </w:rPr>
-              <w:t>Quantized</w:t>
+              <w:t>Quantized versions</w:t>
             </w:r>
           </w:p>
         </w:tc>
       </w:tr>
       <w:tr>
+        <w:trPr>
+          <w:cantSplit/>
+        </w:trPr>
         <w:tc>
           <w:tcPr>
-            <w:tcW w:type="dxa" w:w="1170"/>
+            <w:tcW w:type="dxa" w:w="4034"/>
           </w:tcPr>
           <w:p>
             <w:r>
@@ -627,81 +1439,7 @@
         </w:tc>
         <w:tc>
           <w:tcPr>
-            <w:tcW w:type="dxa" w:w="1170"/>
-          </w:tcPr>
-          <w:p>
-            <w:r>
-              <w:rPr>
-                <w:sz w:val="18"/>
-              </w:rPr>
-            </w:r>
-            <w:r>
-              <w:rPr>
-                <w:sz w:val="18"/>
-              </w:rPr>
-              <w:t>2025-10</w:t>
-            </w:r>
-          </w:p>
-        </w:tc>
-        <w:tc>
-          <w:tcPr>
-            <w:tcW w:type="dxa" w:w="1170"/>
-          </w:tcPr>
-          <w:p>
-            <w:r>
-              <w:rPr>
-                <w:sz w:val="18"/>
-              </w:rPr>
-            </w:r>
-            <w:r>
-              <w:rPr>
-                <w:sz w:val="18"/>
-              </w:rPr>
-              <w:t>33.4B</w:t>
-            </w:r>
-          </w:p>
-        </w:tc>
-        <w:tc>
-          <w:tcPr>
-            <w:tcW w:type="dxa" w:w="1170"/>
-          </w:tcPr>
-          <w:p>
-            <w:r>
-              <w:rPr>
-                <w:sz w:val="18"/>
-              </w:rPr>
-            </w:r>
-            <w:r>
-              <w:rPr>
-                <w:b/>
-                <w:sz w:val="18"/>
-              </w:rPr>
-              <w:t>17.1M</w:t>
-            </w:r>
-          </w:p>
-        </w:tc>
-        <w:tc>
-          <w:tcPr>
-            <w:tcW w:type="dxa" w:w="1170"/>
-          </w:tcPr>
-          <w:p>
-            <w:r>
-              <w:rPr>
-                <w:sz w:val="18"/>
-              </w:rPr>
-            </w:r>
-            <w:r>
-              <w:rPr>
-                <w:b/>
-                <w:sz w:val="18"/>
-              </w:rPr>
-              <w:t>401k</w:t>
-            </w:r>
-          </w:p>
-        </w:tc>
-        <w:tc>
-          <w:tcPr>
-            <w:tcW w:type="dxa" w:w="1170"/>
+            <w:tcW w:type="dxa" w:w="2042"/>
           </w:tcPr>
           <w:p>
             <w:r>
@@ -719,7 +1457,7 @@
         </w:tc>
         <w:tc>
           <w:tcPr>
-            <w:tcW w:type="dxa" w:w="1170"/>
+            <w:tcW w:type="dxa" w:w="1679"/>
           </w:tcPr>
           <w:p>
             <w:r>
@@ -737,7 +1475,7 @@
         </w:tc>
         <w:tc>
           <w:tcPr>
-            <w:tcW w:type="dxa" w:w="1170"/>
+            <w:tcW w:type="dxa" w:w="2324"/>
           </w:tcPr>
           <w:p>
             <w:r>
@@ -755,9 +1493,12 @@
         </w:tc>
       </w:tr>
       <w:tr>
+        <w:trPr>
+          <w:cantSplit/>
+        </w:trPr>
         <w:tc>
           <w:tcPr>
-            <w:tcW w:type="dxa" w:w="1170"/>
+            <w:tcW w:type="dxa" w:w="4034"/>
           </w:tcPr>
           <w:p>
             <w:r>
@@ -775,79 +1516,7 @@
         </w:tc>
         <w:tc>
           <w:tcPr>
-            <w:tcW w:type="dxa" w:w="1170"/>
-          </w:tcPr>
-          <w:p>
-            <w:r>
-              <w:rPr>
-                <w:sz w:val="18"/>
-              </w:rPr>
-            </w:r>
-            <w:r>
-              <w:rPr>
-                <w:sz w:val="18"/>
-              </w:rPr>
-              <w:t>2025-03</w:t>
-            </w:r>
-          </w:p>
-        </w:tc>
-        <w:tc>
-          <w:tcPr>
-            <w:tcW w:type="dxa" w:w="1170"/>
-          </w:tcPr>
-          <w:p>
-            <w:r>
-              <w:rPr>
-                <w:sz w:val="18"/>
-              </w:rPr>
-            </w:r>
-            <w:r>
-              <w:rPr>
-                <w:sz w:val="18"/>
-              </w:rPr>
-              <w:t>27.4B</w:t>
-            </w:r>
-          </w:p>
-        </w:tc>
-        <w:tc>
-          <w:tcPr>
-            <w:tcW w:type="dxa" w:w="1170"/>
-          </w:tcPr>
-          <w:p>
-            <w:r>
-              <w:rPr>
-                <w:sz w:val="18"/>
-              </w:rPr>
-            </w:r>
-            <w:r>
-              <w:rPr>
-                <w:sz w:val="18"/>
-              </w:rPr>
-              <w:t>16.9M</w:t>
-            </w:r>
-          </w:p>
-        </w:tc>
-        <w:tc>
-          <w:tcPr>
-            <w:tcW w:type="dxa" w:w="1170"/>
-          </w:tcPr>
-          <w:p>
-            <w:r>
-              <w:rPr>
-                <w:sz w:val="18"/>
-              </w:rPr>
-            </w:r>
-            <w:r>
-              <w:rPr>
-                <w:sz w:val="18"/>
-              </w:rPr>
-              <w:t>371k</w:t>
-            </w:r>
-          </w:p>
-        </w:tc>
-        <w:tc>
-          <w:tcPr>
-            <w:tcW w:type="dxa" w:w="1170"/>
+            <w:tcW w:type="dxa" w:w="2042"/>
           </w:tcPr>
           <w:p>
             <w:r>
@@ -865,7 +1534,7 @@
         </w:tc>
         <w:tc>
           <w:tcPr>
-            <w:tcW w:type="dxa" w:w="1170"/>
+            <w:tcW w:type="dxa" w:w="1679"/>
           </w:tcPr>
           <w:p>
             <w:r>
@@ -883,7 +1552,7 @@
         </w:tc>
         <w:tc>
           <w:tcPr>
-            <w:tcW w:type="dxa" w:w="1170"/>
+            <w:tcW w:type="dxa" w:w="2324"/>
           </w:tcPr>
           <w:p>
             <w:r>
@@ -901,9 +1570,12 @@
         </w:tc>
       </w:tr>
       <w:tr>
+        <w:trPr>
+          <w:cantSplit/>
+        </w:trPr>
         <w:tc>
           <w:tcPr>
-            <w:tcW w:type="dxa" w:w="1170"/>
+            <w:tcW w:type="dxa" w:w="4034"/>
           </w:tcPr>
           <w:p>
             <w:r>
@@ -915,85 +1587,13 @@
               <w:rPr>
                 <w:sz w:val="18"/>
               </w:rPr>
-              <w:t>Mistral Small 3.2 24B Instruct</w:t>
+              <w:t>Mistral Small 3.2 24B</w:t>
             </w:r>
           </w:p>
         </w:tc>
         <w:tc>
           <w:tcPr>
-            <w:tcW w:type="dxa" w:w="1170"/>
-          </w:tcPr>
-          <w:p>
-            <w:r>
-              <w:rPr>
-                <w:sz w:val="18"/>
-              </w:rPr>
-            </w:r>
-            <w:r>
-              <w:rPr>
-                <w:sz w:val="18"/>
-              </w:rPr>
-              <w:t>2025-06</w:t>
-            </w:r>
-          </w:p>
-        </w:tc>
-        <w:tc>
-          <w:tcPr>
-            <w:tcW w:type="dxa" w:w="1170"/>
-          </w:tcPr>
-          <w:p>
-            <w:r>
-              <w:rPr>
-                <w:sz w:val="18"/>
-              </w:rPr>
-            </w:r>
-            <w:r>
-              <w:rPr>
-                <w:sz w:val="18"/>
-              </w:rPr>
-              <w:t>24.0B</w:t>
-            </w:r>
-          </w:p>
-        </w:tc>
-        <w:tc>
-          <w:tcPr>
-            <w:tcW w:type="dxa" w:w="1170"/>
-          </w:tcPr>
-          <w:p>
-            <w:r>
-              <w:rPr>
-                <w:sz w:val="18"/>
-              </w:rPr>
-            </w:r>
-            <w:r>
-              <w:rPr>
-                <w:sz w:val="18"/>
-              </w:rPr>
-              <w:t>5.2M</w:t>
-            </w:r>
-          </w:p>
-        </w:tc>
-        <w:tc>
-          <w:tcPr>
-            <w:tcW w:type="dxa" w:w="1170"/>
-          </w:tcPr>
-          <w:p>
-            <w:r>
-              <w:rPr>
-                <w:sz w:val="18"/>
-              </w:rPr>
-            </w:r>
-            <w:r>
-              <w:rPr>
-                <w:sz w:val="18"/>
-              </w:rPr>
-              <w:t>128k</w:t>
-            </w:r>
-          </w:p>
-        </w:tc>
-        <w:tc>
-          <w:tcPr>
-            <w:tcW w:type="dxa" w:w="1170"/>
+            <w:tcW w:type="dxa" w:w="2042"/>
           </w:tcPr>
           <w:p>
             <w:r>
@@ -1011,7 +1611,7 @@
         </w:tc>
         <w:tc>
           <w:tcPr>
-            <w:tcW w:type="dxa" w:w="1170"/>
+            <w:tcW w:type="dxa" w:w="1679"/>
           </w:tcPr>
           <w:p>
             <w:r>
@@ -1029,7 +1629,7 @@
         </w:tc>
         <w:tc>
           <w:tcPr>
-            <w:tcW w:type="dxa" w:w="1170"/>
+            <w:tcW w:type="dxa" w:w="2324"/>
           </w:tcPr>
           <w:p>
             <w:r>
@@ -1047,9 +1647,12 @@
         </w:tc>
       </w:tr>
       <w:tr>
+        <w:trPr>
+          <w:cantSplit/>
+        </w:trPr>
         <w:tc>
           <w:tcPr>
-            <w:tcW w:type="dxa" w:w="1170"/>
+            <w:tcW w:type="dxa" w:w="4034"/>
           </w:tcPr>
           <w:p>
             <w:r>
@@ -1061,85 +1664,13 @@
               <w:rPr>
                 <w:sz w:val="18"/>
               </w:rPr>
-              <w:t>Mistral Small 3.1 24B Instruct</w:t>
+              <w:t>Mistral Small 3.1 24B</w:t>
             </w:r>
           </w:p>
         </w:tc>
         <w:tc>
           <w:tcPr>
-            <w:tcW w:type="dxa" w:w="1170"/>
-          </w:tcPr>
-          <w:p>
-            <w:r>
-              <w:rPr>
-                <w:sz w:val="18"/>
-              </w:rPr>
-            </w:r>
-            <w:r>
-              <w:rPr>
-                <w:sz w:val="18"/>
-              </w:rPr>
-              <w:t>2025-03</w:t>
-            </w:r>
-          </w:p>
-        </w:tc>
-        <w:tc>
-          <w:tcPr>
-            <w:tcW w:type="dxa" w:w="1170"/>
-          </w:tcPr>
-          <w:p>
-            <w:r>
-              <w:rPr>
-                <w:sz w:val="18"/>
-              </w:rPr>
-            </w:r>
-            <w:r>
-              <w:rPr>
-                <w:sz w:val="18"/>
-              </w:rPr>
-              <w:t>24.0B</w:t>
-            </w:r>
-          </w:p>
-        </w:tc>
-        <w:tc>
-          <w:tcPr>
-            <w:tcW w:type="dxa" w:w="1170"/>
-          </w:tcPr>
-          <w:p>
-            <w:r>
-              <w:rPr>
-                <w:sz w:val="18"/>
-              </w:rPr>
-            </w:r>
-            <w:r>
-              <w:rPr>
-                <w:sz w:val="18"/>
-              </w:rPr>
-              <w:t>4.1M</w:t>
-            </w:r>
-          </w:p>
-        </w:tc>
-        <w:tc>
-          <w:tcPr>
-            <w:tcW w:type="dxa" w:w="1170"/>
-          </w:tcPr>
-          <w:p>
-            <w:r>
-              <w:rPr>
-                <w:sz w:val="18"/>
-              </w:rPr>
-            </w:r>
-            <w:r>
-              <w:rPr>
-                <w:sz w:val="18"/>
-              </w:rPr>
-              <w:t>241k</w:t>
-            </w:r>
-          </w:p>
-        </w:tc>
-        <w:tc>
-          <w:tcPr>
-            <w:tcW w:type="dxa" w:w="1170"/>
+            <w:tcW w:type="dxa" w:w="2042"/>
           </w:tcPr>
           <w:p>
             <w:r>
@@ -1157,7 +1688,7 @@
         </w:tc>
         <w:tc>
           <w:tcPr>
-            <w:tcW w:type="dxa" w:w="1170"/>
+            <w:tcW w:type="dxa" w:w="1679"/>
           </w:tcPr>
           <w:p>
             <w:r>
@@ -1175,7 +1706,7 @@
         </w:tc>
         <w:tc>
           <w:tcPr>
-            <w:tcW w:type="dxa" w:w="1170"/>
+            <w:tcW w:type="dxa" w:w="2324"/>
           </w:tcPr>
           <w:p>
             <w:r>
@@ -1193,9 +1724,12 @@
         </w:tc>
       </w:tr>
       <w:tr>
+        <w:trPr>
+          <w:cantSplit/>
+        </w:trPr>
         <w:tc>
           <w:tcPr>
-            <w:tcW w:type="dxa" w:w="1170"/>
+            <w:tcW w:type="dxa" w:w="4034"/>
           </w:tcPr>
           <w:p>
             <w:r>
@@ -1213,79 +1747,7 @@
         </w:tc>
         <w:tc>
           <w:tcPr>
-            <w:tcW w:type="dxa" w:w="1170"/>
-          </w:tcPr>
-          <w:p>
-            <w:r>
-              <w:rPr>
-                <w:sz w:val="18"/>
-              </w:rPr>
-            </w:r>
-            <w:r>
-              <w:rPr>
-                <w:sz w:val="18"/>
-              </w:rPr>
-              <w:t>2025-04</w:t>
-            </w:r>
-          </w:p>
-        </w:tc>
-        <w:tc>
-          <w:tcPr>
-            <w:tcW w:type="dxa" w:w="1170"/>
-          </w:tcPr>
-          <w:p>
-            <w:r>
-              <w:rPr>
-                <w:sz w:val="18"/>
-              </w:rPr>
-            </w:r>
-            <w:r>
-              <w:rPr>
-                <w:sz w:val="18"/>
-              </w:rPr>
-              <w:t>38.4B</w:t>
-            </w:r>
-          </w:p>
-        </w:tc>
-        <w:tc>
-          <w:tcPr>
-            <w:tcW w:type="dxa" w:w="1170"/>
-          </w:tcPr>
-          <w:p>
-            <w:r>
-              <w:rPr>
-                <w:sz w:val="18"/>
-              </w:rPr>
-            </w:r>
-            <w:r>
-              <w:rPr>
-                <w:sz w:val="18"/>
-              </w:rPr>
-              <w:t>1.3M</w:t>
-            </w:r>
-          </w:p>
-        </w:tc>
-        <w:tc>
-          <w:tcPr>
-            <w:tcW w:type="dxa" w:w="1170"/>
-          </w:tcPr>
-          <w:p>
-            <w:r>
-              <w:rPr>
-                <w:sz w:val="18"/>
-              </w:rPr>
-            </w:r>
-            <w:r>
-              <w:rPr>
-                <w:sz w:val="18"/>
-              </w:rPr>
-              <w:t>2k</w:t>
-            </w:r>
-          </w:p>
-        </w:tc>
-        <w:tc>
-          <w:tcPr>
-            <w:tcW w:type="dxa" w:w="1170"/>
+            <w:tcW w:type="dxa" w:w="2042"/>
           </w:tcPr>
           <w:p>
             <w:r>
@@ -1303,7 +1765,7 @@
         </w:tc>
         <w:tc>
           <w:tcPr>
-            <w:tcW w:type="dxa" w:w="1170"/>
+            <w:tcW w:type="dxa" w:w="1679"/>
           </w:tcPr>
           <w:p>
             <w:r>
@@ -1321,7 +1783,7 @@
         </w:tc>
         <w:tc>
           <w:tcPr>
-            <w:tcW w:type="dxa" w:w="1170"/>
+            <w:tcW w:type="dxa" w:w="2324"/>
           </w:tcPr>
           <w:p>
             <w:r>
@@ -1339,9 +1801,12 @@
         </w:tc>
       </w:tr>
       <w:tr>
+        <w:trPr>
+          <w:cantSplit/>
+        </w:trPr>
         <w:tc>
           <w:tcPr>
-            <w:tcW w:type="dxa" w:w="1170"/>
+            <w:tcW w:type="dxa" w:w="4034"/>
           </w:tcPr>
           <w:p>
             <w:r>
@@ -1359,79 +1824,7 @@
         </w:tc>
         <w:tc>
           <w:tcPr>
-            <w:tcW w:type="dxa" w:w="1170"/>
-          </w:tcPr>
-          <w:p>
-            <w:r>
-              <w:rPr>
-                <w:sz w:val="18"/>
-              </w:rPr>
-            </w:r>
-            <w:r>
-              <w:rPr>
-                <w:sz w:val="18"/>
-              </w:rPr>
-              <w:t>2025-08</w:t>
-            </w:r>
-          </w:p>
-        </w:tc>
-        <w:tc>
-          <w:tcPr>
-            <w:tcW w:type="dxa" w:w="1170"/>
-          </w:tcPr>
-          <w:p>
-            <w:r>
-              <w:rPr>
-                <w:sz w:val="18"/>
-              </w:rPr>
-            </w:r>
-            <w:r>
-              <w:rPr>
-                <w:sz w:val="18"/>
-              </w:rPr>
-              <w:t>38.4B</w:t>
-            </w:r>
-          </w:p>
-        </w:tc>
-        <w:tc>
-          <w:tcPr>
-            <w:tcW w:type="dxa" w:w="1170"/>
-          </w:tcPr>
-          <w:p>
-            <w:r>
-              <w:rPr>
-                <w:sz w:val="18"/>
-              </w:rPr>
-            </w:r>
-            <w:r>
-              <w:rPr>
-                <w:sz w:val="18"/>
-              </w:rPr>
-              <w:t>0.3M</w:t>
-            </w:r>
-          </w:p>
-        </w:tc>
-        <w:tc>
-          <w:tcPr>
-            <w:tcW w:type="dxa" w:w="1170"/>
-          </w:tcPr>
-          <w:p>
-            <w:r>
-              <w:rPr>
-                <w:sz w:val="18"/>
-              </w:rPr>
-            </w:r>
-            <w:r>
-              <w:rPr>
-                <w:sz w:val="18"/>
-              </w:rPr>
-              <w:t>20k</w:t>
-            </w:r>
-          </w:p>
-        </w:tc>
-        <w:tc>
-          <w:tcPr>
-            <w:tcW w:type="dxa" w:w="1170"/>
+            <w:tcW w:type="dxa" w:w="2042"/>
           </w:tcPr>
           <w:p>
             <w:r>
@@ -1449,7 +1842,7 @@
         </w:tc>
         <w:tc>
           <w:tcPr>
-            <w:tcW w:type="dxa" w:w="1170"/>
+            <w:tcW w:type="dxa" w:w="1679"/>
           </w:tcPr>
           <w:p>
             <w:r>
@@ -1467,7 +1860,7 @@
         </w:tc>
         <w:tc>
           <w:tcPr>
-            <w:tcW w:type="dxa" w:w="1170"/>
+            <w:tcW w:type="dxa" w:w="2324"/>
           </w:tcPr>
           <w:p>
             <w:r>
@@ -1485,9 +1878,12 @@
         </w:tc>
       </w:tr>
       <w:tr>
+        <w:trPr>
+          <w:cantSplit/>
+        </w:trPr>
         <w:tc>
           <w:tcPr>
-            <w:tcW w:type="dxa" w:w="1170"/>
+            <w:tcW w:type="dxa" w:w="4034"/>
           </w:tcPr>
           <w:p>
             <w:r>
@@ -1505,79 +1901,7 @@
         </w:tc>
         <w:tc>
           <w:tcPr>
-            <w:tcW w:type="dxa" w:w="1170"/>
-          </w:tcPr>
-          <w:p>
-            <w:r>
-              <w:rPr>
-                <w:sz w:val="18"/>
-              </w:rPr>
-            </w:r>
-            <w:r>
-              <w:rPr>
-                <w:sz w:val="18"/>
-              </w:rPr>
-              <w:t>2025-02</w:t>
-            </w:r>
-          </w:p>
-        </w:tc>
-        <w:tc>
-          <w:tcPr>
-            <w:tcW w:type="dxa" w:w="1170"/>
-          </w:tcPr>
-          <w:p>
-            <w:r>
-              <w:rPr>
-                <w:sz w:val="18"/>
-              </w:rPr>
-            </w:r>
-            <w:r>
-              <w:rPr>
-                <w:sz w:val="18"/>
-              </w:rPr>
-              <w:t>34.9B</w:t>
-            </w:r>
-          </w:p>
-        </w:tc>
-        <w:tc>
-          <w:tcPr>
-            <w:tcW w:type="dxa" w:w="1170"/>
-          </w:tcPr>
-          <w:p>
-            <w:r>
-              <w:rPr>
-                <w:sz w:val="18"/>
-              </w:rPr>
-            </w:r>
-            <w:r>
-              <w:rPr>
-                <w:sz w:val="18"/>
-              </w:rPr>
-              <w:t>0.1M</w:t>
-            </w:r>
-          </w:p>
-        </w:tc>
-        <w:tc>
-          <w:tcPr>
-            <w:tcW w:type="dxa" w:w="1170"/>
-          </w:tcPr>
-          <w:p>
-            <w:r>
-              <w:rPr>
-                <w:sz w:val="18"/>
-              </w:rPr>
-            </w:r>
-            <w:r>
-              <w:rPr>
-                <w:sz w:val="18"/>
-              </w:rPr>
-              <w:t>0.2k</w:t>
-            </w:r>
-          </w:p>
-        </w:tc>
-        <w:tc>
-          <w:tcPr>
-            <w:tcW w:type="dxa" w:w="1170"/>
+            <w:tcW w:type="dxa" w:w="2042"/>
           </w:tcPr>
           <w:p>
             <w:r>
@@ -1595,7 +1919,7 @@
         </w:tc>
         <w:tc>
           <w:tcPr>
-            <w:tcW w:type="dxa" w:w="1170"/>
+            <w:tcW w:type="dxa" w:w="1679"/>
           </w:tcPr>
           <w:p>
             <w:r>
@@ -1613,7 +1937,7 @@
         </w:tc>
         <w:tc>
           <w:tcPr>
-            <w:tcW w:type="dxa" w:w="1170"/>
+            <w:tcW w:type="dxa" w:w="2324"/>
           </w:tcPr>
           <w:p>
             <w:r>
@@ -1631,9 +1955,12 @@
         </w:tc>
       </w:tr>
       <w:tr>
+        <w:trPr>
+          <w:cantSplit/>
+        </w:trPr>
         <w:tc>
           <w:tcPr>
-            <w:tcW w:type="dxa" w:w="1170"/>
+            <w:tcW w:type="dxa" w:w="4034"/>
           </w:tcPr>
           <w:p>
             <w:r>
@@ -1651,79 +1978,7 @@
         </w:tc>
         <w:tc>
           <w:tcPr>
-            <w:tcW w:type="dxa" w:w="1170"/>
-          </w:tcPr>
-          <w:p>
-            <w:r>
-              <w:rPr>
-                <w:sz w:val="18"/>
-              </w:rPr>
-            </w:r>
-            <w:r>
-              <w:rPr>
-                <w:sz w:val="18"/>
-              </w:rPr>
-              <w:t>2025-03</w:t>
-            </w:r>
-          </w:p>
-        </w:tc>
-        <w:tc>
-          <w:tcPr>
-            <w:tcW w:type="dxa" w:w="1170"/>
-          </w:tcPr>
-          <w:p>
-            <w:r>
-              <w:rPr>
-                <w:sz w:val="18"/>
-              </w:rPr>
-            </w:r>
-            <w:r>
-              <w:rPr>
-                <w:sz w:val="18"/>
-              </w:rPr>
-              <w:t>33.1B</w:t>
-            </w:r>
-          </w:p>
-        </w:tc>
-        <w:tc>
-          <w:tcPr>
-            <w:tcW w:type="dxa" w:w="1170"/>
-          </w:tcPr>
-          <w:p>
-            <w:r>
-              <w:rPr>
-                <w:sz w:val="18"/>
-              </w:rPr>
-            </w:r>
-            <w:r>
-              <w:rPr>
-                <w:sz w:val="18"/>
-              </w:rPr>
-              <w:t>6.5k</w:t>
-            </w:r>
-          </w:p>
-        </w:tc>
-        <w:tc>
-          <w:tcPr>
-            <w:tcW w:type="dxa" w:w="1170"/>
-          </w:tcPr>
-          <w:p>
-            <w:r>
-              <w:rPr>
-                <w:sz w:val="18"/>
-              </w:rPr>
-            </w:r>
-            <w:r>
-              <w:rPr>
-                <w:sz w:val="18"/>
-              </w:rPr>
-              <w:t>0.5k</w:t>
-            </w:r>
-          </w:p>
-        </w:tc>
-        <w:tc>
-          <w:tcPr>
-            <w:tcW w:type="dxa" w:w="1170"/>
+            <w:tcW w:type="dxa" w:w="2042"/>
           </w:tcPr>
           <w:p>
             <w:r>
@@ -1741,7 +1996,7 @@
         </w:tc>
         <w:tc>
           <w:tcPr>
-            <w:tcW w:type="dxa" w:w="1170"/>
+            <w:tcW w:type="dxa" w:w="1679"/>
           </w:tcPr>
           <w:p>
             <w:r>
@@ -1759,7 +2014,7 @@
         </w:tc>
         <w:tc>
           <w:tcPr>
-            <w:tcW w:type="dxa" w:w="1170"/>
+            <w:tcW w:type="dxa" w:w="2324"/>
           </w:tcPr>
           <w:p>
             <w:r>
@@ -2191,20 +2446,24 @@
       <w:tblPr>
         <w:tblStyle w:val="TableGrid"/>
         <w:tblW w:type="auto" w:w="0"/>
+        <w:tblLayout w:type="fixed"/>
         <w:tblLook w:firstColumn="1" w:firstRow="1" w:lastColumn="0" w:lastRow="0" w:noHBand="0" w:noVBand="1" w:val="04A0"/>
       </w:tblPr>
       <w:tblGrid>
-        <w:gridCol w:w="1560"/>
-        <w:gridCol w:w="1560"/>
-        <w:gridCol w:w="1560"/>
-        <w:gridCol w:w="1560"/>
-        <w:gridCol w:w="1560"/>
-        <w:gridCol w:w="1560"/>
+        <w:gridCol w:w="1971"/>
+        <w:gridCol w:w="1920"/>
+        <w:gridCol w:w="1860"/>
+        <w:gridCol w:w="1179"/>
+        <w:gridCol w:w="990"/>
+        <w:gridCol w:w="2161"/>
       </w:tblGrid>
       <w:tr>
+        <w:trPr>
+          <w:cantSplit/>
+        </w:trPr>
         <w:tc>
           <w:tcPr>
-            <w:tcW w:type="dxa" w:w="1560"/>
+            <w:tcW w:type="dxa" w:w="1971"/>
           </w:tcPr>
           <w:p>
             <w:r>
@@ -2224,7 +2483,7 @@
         </w:tc>
         <w:tc>
           <w:tcPr>
-            <w:tcW w:type="dxa" w:w="1560"/>
+            <w:tcW w:type="dxa" w:w="1920"/>
           </w:tcPr>
           <w:p>
             <w:r>
@@ -2244,7 +2503,7 @@
         </w:tc>
         <w:tc>
           <w:tcPr>
-            <w:tcW w:type="dxa" w:w="1560"/>
+            <w:tcW w:type="dxa" w:w="1860"/>
           </w:tcPr>
           <w:p>
             <w:r>
@@ -2264,7 +2523,7 @@
         </w:tc>
         <w:tc>
           <w:tcPr>
-            <w:tcW w:type="dxa" w:w="1560"/>
+            <w:tcW w:type="dxa" w:w="1179"/>
           </w:tcPr>
           <w:p>
             <w:r>
@@ -2284,7 +2543,7 @@
         </w:tc>
         <w:tc>
           <w:tcPr>
-            <w:tcW w:type="dxa" w:w="1560"/>
+            <w:tcW w:type="dxa" w:w="990"/>
           </w:tcPr>
           <w:p>
             <w:r>
@@ -2304,7 +2563,7 @@
         </w:tc>
         <w:tc>
           <w:tcPr>
-            <w:tcW w:type="dxa" w:w="1560"/>
+            <w:tcW w:type="dxa" w:w="2161"/>
           </w:tcPr>
           <w:p>
             <w:r>
@@ -2324,9 +2583,12 @@
         </w:tc>
       </w:tr>
       <w:tr>
+        <w:trPr>
+          <w:cantSplit/>
+        </w:trPr>
         <w:tc>
           <w:tcPr>
-            <w:tcW w:type="dxa" w:w="1560"/>
+            <w:tcW w:type="dxa" w:w="1971"/>
           </w:tcPr>
           <w:p>
             <w:r>
@@ -2344,7 +2606,7 @@
         </w:tc>
         <w:tc>
           <w:tcPr>
-            <w:tcW w:type="dxa" w:w="1560"/>
+            <w:tcW w:type="dxa" w:w="1920"/>
           </w:tcPr>
           <w:p>
             <w:r>
@@ -2362,7 +2624,7 @@
         </w:tc>
         <w:tc>
           <w:tcPr>
-            <w:tcW w:type="dxa" w:w="1560"/>
+            <w:tcW w:type="dxa" w:w="1860"/>
           </w:tcPr>
           <w:p>
             <w:r>
@@ -2380,7 +2642,7 @@
         </w:tc>
         <w:tc>
           <w:tcPr>
-            <w:tcW w:type="dxa" w:w="1560"/>
+            <w:tcW w:type="dxa" w:w="1179"/>
           </w:tcPr>
           <w:p>
             <w:r>
@@ -2398,7 +2660,7 @@
         </w:tc>
         <w:tc>
           <w:tcPr>
-            <w:tcW w:type="dxa" w:w="1560"/>
+            <w:tcW w:type="dxa" w:w="990"/>
           </w:tcPr>
           <w:p>
             <w:r>
@@ -2417,7 +2679,7 @@
         </w:tc>
         <w:tc>
           <w:tcPr>
-            <w:tcW w:type="dxa" w:w="1560"/>
+            <w:tcW w:type="dxa" w:w="2161"/>
           </w:tcPr>
           <w:p>
             <w:r>
@@ -2435,9 +2697,12 @@
         </w:tc>
       </w:tr>
       <w:tr>
+        <w:trPr>
+          <w:cantSplit/>
+        </w:trPr>
         <w:tc>
           <w:tcPr>
-            <w:tcW w:type="dxa" w:w="1560"/>
+            <w:tcW w:type="dxa" w:w="1971"/>
           </w:tcPr>
           <w:p>
             <w:r>
@@ -2455,7 +2720,7 @@
         </w:tc>
         <w:tc>
           <w:tcPr>
-            <w:tcW w:type="dxa" w:w="1560"/>
+            <w:tcW w:type="dxa" w:w="1920"/>
           </w:tcPr>
           <w:p>
             <w:r>
@@ -2473,7 +2738,7 @@
         </w:tc>
         <w:tc>
           <w:tcPr>
-            <w:tcW w:type="dxa" w:w="1560"/>
+            <w:tcW w:type="dxa" w:w="1860"/>
           </w:tcPr>
           <w:p>
             <w:r>
@@ -2491,7 +2756,7 @@
         </w:tc>
         <w:tc>
           <w:tcPr>
-            <w:tcW w:type="dxa" w:w="1560"/>
+            <w:tcW w:type="dxa" w:w="1179"/>
           </w:tcPr>
           <w:p>
             <w:r>
@@ -2509,7 +2774,7 @@
         </w:tc>
         <w:tc>
           <w:tcPr>
-            <w:tcW w:type="dxa" w:w="1560"/>
+            <w:tcW w:type="dxa" w:w="990"/>
           </w:tcPr>
           <w:p>
             <w:r>
@@ -2527,7 +2792,7 @@
         </w:tc>
         <w:tc>
           <w:tcPr>
-            <w:tcW w:type="dxa" w:w="1560"/>
+            <w:tcW w:type="dxa" w:w="2161"/>
           </w:tcPr>
           <w:p>
             <w:r>
@@ -2545,9 +2810,12 @@
         </w:tc>
       </w:tr>
       <w:tr>
+        <w:trPr>
+          <w:cantSplit/>
+        </w:trPr>
         <w:tc>
           <w:tcPr>
-            <w:tcW w:type="dxa" w:w="1560"/>
+            <w:tcW w:type="dxa" w:w="1971"/>
           </w:tcPr>
           <w:p>
             <w:r>
@@ -2565,7 +2833,7 @@
         </w:tc>
         <w:tc>
           <w:tcPr>
-            <w:tcW w:type="dxa" w:w="1560"/>
+            <w:tcW w:type="dxa" w:w="1920"/>
           </w:tcPr>
           <w:p>
             <w:r>
@@ -2583,7 +2851,7 @@
         </w:tc>
         <w:tc>
           <w:tcPr>
-            <w:tcW w:type="dxa" w:w="1560"/>
+            <w:tcW w:type="dxa" w:w="1860"/>
           </w:tcPr>
           <w:p>
             <w:r>
@@ -2601,7 +2869,7 @@
         </w:tc>
         <w:tc>
           <w:tcPr>
-            <w:tcW w:type="dxa" w:w="1560"/>
+            <w:tcW w:type="dxa" w:w="1179"/>
           </w:tcPr>
           <w:p>
             <w:r>
@@ -2619,7 +2887,7 @@
         </w:tc>
         <w:tc>
           <w:tcPr>
-            <w:tcW w:type="dxa" w:w="1560"/>
+            <w:tcW w:type="dxa" w:w="990"/>
           </w:tcPr>
           <w:p>
             <w:r>
@@ -2638,7 +2906,7 @@
         </w:tc>
         <w:tc>
           <w:tcPr>
-            <w:tcW w:type="dxa" w:w="1560"/>
+            <w:tcW w:type="dxa" w:w="2161"/>
           </w:tcPr>
           <w:p>
             <w:r>
@@ -2656,9 +2924,12 @@
         </w:tc>
       </w:tr>
       <w:tr>
+        <w:trPr>
+          <w:cantSplit/>
+        </w:trPr>
         <w:tc>
           <w:tcPr>
-            <w:tcW w:type="dxa" w:w="1560"/>
+            <w:tcW w:type="dxa" w:w="1971"/>
           </w:tcPr>
           <w:p>
             <w:r>
@@ -2676,7 +2947,7 @@
         </w:tc>
         <w:tc>
           <w:tcPr>
-            <w:tcW w:type="dxa" w:w="1560"/>
+            <w:tcW w:type="dxa" w:w="1920"/>
           </w:tcPr>
           <w:p>
             <w:r>
@@ -2694,7 +2965,7 @@
         </w:tc>
         <w:tc>
           <w:tcPr>
-            <w:tcW w:type="dxa" w:w="1560"/>
+            <w:tcW w:type="dxa" w:w="1860"/>
           </w:tcPr>
           <w:p>
             <w:r>
@@ -2712,7 +2983,7 @@
         </w:tc>
         <w:tc>
           <w:tcPr>
-            <w:tcW w:type="dxa" w:w="1560"/>
+            <w:tcW w:type="dxa" w:w="1179"/>
           </w:tcPr>
           <w:p>
             <w:r>
@@ -2730,7 +3001,7 @@
         </w:tc>
         <w:tc>
           <w:tcPr>
-            <w:tcW w:type="dxa" w:w="1560"/>
+            <w:tcW w:type="dxa" w:w="990"/>
           </w:tcPr>
           <w:p>
             <w:r>
@@ -2748,7 +3019,7 @@
         </w:tc>
         <w:tc>
           <w:tcPr>
-            <w:tcW w:type="dxa" w:w="1560"/>
+            <w:tcW w:type="dxa" w:w="2161"/>
           </w:tcPr>
           <w:p>
             <w:r>
@@ -2766,9 +3037,12 @@
         </w:tc>
       </w:tr>
       <w:tr>
+        <w:trPr>
+          <w:cantSplit/>
+        </w:trPr>
         <w:tc>
           <w:tcPr>
-            <w:tcW w:type="dxa" w:w="1560"/>
+            <w:tcW w:type="dxa" w:w="1971"/>
           </w:tcPr>
           <w:p>
             <w:r>
@@ -2786,7 +3060,7 @@
         </w:tc>
         <w:tc>
           <w:tcPr>
-            <w:tcW w:type="dxa" w:w="1560"/>
+            <w:tcW w:type="dxa" w:w="1920"/>
           </w:tcPr>
           <w:p>
             <w:r>
@@ -2804,7 +3078,7 @@
         </w:tc>
         <w:tc>
           <w:tcPr>
-            <w:tcW w:type="dxa" w:w="1560"/>
+            <w:tcW w:type="dxa" w:w="1860"/>
           </w:tcPr>
           <w:p>
             <w:r>
@@ -2822,7 +3096,7 @@
         </w:tc>
         <w:tc>
           <w:tcPr>
-            <w:tcW w:type="dxa" w:w="1560"/>
+            <w:tcW w:type="dxa" w:w="1179"/>
           </w:tcPr>
           <w:p>
             <w:r>
@@ -2840,7 +3114,7 @@
         </w:tc>
         <w:tc>
           <w:tcPr>
-            <w:tcW w:type="dxa" w:w="1560"/>
+            <w:tcW w:type="dxa" w:w="990"/>
           </w:tcPr>
           <w:p>
             <w:r>
@@ -2858,7 +3132,7 @@
         </w:tc>
         <w:tc>
           <w:tcPr>
-            <w:tcW w:type="dxa" w:w="1560"/>
+            <w:tcW w:type="dxa" w:w="2161"/>
           </w:tcPr>
           <w:p>
             <w:r>
@@ -2876,9 +3150,12 @@
         </w:tc>
       </w:tr>
       <w:tr>
+        <w:trPr>
+          <w:cantSplit/>
+        </w:trPr>
         <w:tc>
           <w:tcPr>
-            <w:tcW w:type="dxa" w:w="1560"/>
+            <w:tcW w:type="dxa" w:w="1971"/>
           </w:tcPr>
           <w:p>
             <w:r>
@@ -2896,7 +3173,7 @@
         </w:tc>
         <w:tc>
           <w:tcPr>
-            <w:tcW w:type="dxa" w:w="1560"/>
+            <w:tcW w:type="dxa" w:w="1920"/>
           </w:tcPr>
           <w:p>
             <w:r>
@@ -2914,7 +3191,7 @@
         </w:tc>
         <w:tc>
           <w:tcPr>
-            <w:tcW w:type="dxa" w:w="1560"/>
+            <w:tcW w:type="dxa" w:w="1860"/>
           </w:tcPr>
           <w:p>
             <w:r>
@@ -2932,7 +3209,7 @@
         </w:tc>
         <w:tc>
           <w:tcPr>
-            <w:tcW w:type="dxa" w:w="1560"/>
+            <w:tcW w:type="dxa" w:w="1179"/>
           </w:tcPr>
           <w:p>
             <w:r>
@@ -2950,7 +3227,7 @@
         </w:tc>
         <w:tc>
           <w:tcPr>
-            <w:tcW w:type="dxa" w:w="1560"/>
+            <w:tcW w:type="dxa" w:w="990"/>
           </w:tcPr>
           <w:p>
             <w:r>
@@ -2968,7 +3245,7 @@
         </w:tc>
         <w:tc>
           <w:tcPr>
-            <w:tcW w:type="dxa" w:w="1560"/>
+            <w:tcW w:type="dxa" w:w="2161"/>
           </w:tcPr>
           <w:p>
             <w:r>
@@ -3027,16 +3304,20 @@
       <w:tblPr>
         <w:tblStyle w:val="TableGrid"/>
         <w:tblW w:type="auto" w:w="0"/>
+        <w:tblLayout w:type="fixed"/>
         <w:tblLook w:firstColumn="1" w:firstRow="1" w:lastColumn="0" w:lastRow="0" w:noHBand="0" w:noVBand="1" w:val="04A0"/>
       </w:tblPr>
       <w:tblGrid>
-        <w:gridCol w:w="4680"/>
-        <w:gridCol w:w="4680"/>
+        <w:gridCol w:w="2256"/>
+        <w:gridCol w:w="7824"/>
       </w:tblGrid>
       <w:tr>
+        <w:trPr>
+          <w:cantSplit/>
+        </w:trPr>
         <w:tc>
           <w:tcPr>
-            <w:tcW w:type="dxa" w:w="4680"/>
+            <w:tcW w:type="dxa" w:w="2256"/>
           </w:tcPr>
           <w:p>
             <w:r>
@@ -3049,7 +3330,7 @@
         </w:tc>
         <w:tc>
           <w:tcPr>
-            <w:tcW w:type="dxa" w:w="4680"/>
+            <w:tcW w:type="dxa" w:w="7824"/>
           </w:tcPr>
           <w:p>
             <w:r>
@@ -3069,9 +3350,12 @@
         </w:tc>
       </w:tr>
       <w:tr>
+        <w:trPr>
+          <w:cantSplit/>
+        </w:trPr>
         <w:tc>
           <w:tcPr>
-            <w:tcW w:type="dxa" w:w="4680"/>
+            <w:tcW w:type="dxa" w:w="2256"/>
           </w:tcPr>
           <w:p>
             <w:r>
@@ -3089,7 +3373,7 @@
         </w:tc>
         <w:tc>
           <w:tcPr>
-            <w:tcW w:type="dxa" w:w="4680"/>
+            <w:tcW w:type="dxa" w:w="7824"/>
           </w:tcPr>
           <w:p>
             <w:r>
@@ -3107,9 +3391,12 @@
         </w:tc>
       </w:tr>
       <w:tr>
+        <w:trPr>
+          <w:cantSplit/>
+        </w:trPr>
         <w:tc>
           <w:tcPr>
-            <w:tcW w:type="dxa" w:w="4680"/>
+            <w:tcW w:type="dxa" w:w="2256"/>
           </w:tcPr>
           <w:p>
             <w:r>
@@ -3127,7 +3414,7 @@
         </w:tc>
         <w:tc>
           <w:tcPr>
-            <w:tcW w:type="dxa" w:w="4680"/>
+            <w:tcW w:type="dxa" w:w="7824"/>
           </w:tcPr>
           <w:p>
             <w:r>
@@ -3145,9 +3432,12 @@
         </w:tc>
       </w:tr>
       <w:tr>
+        <w:trPr>
+          <w:cantSplit/>
+        </w:trPr>
         <w:tc>
           <w:tcPr>
-            <w:tcW w:type="dxa" w:w="4680"/>
+            <w:tcW w:type="dxa" w:w="2256"/>
           </w:tcPr>
           <w:p>
             <w:r>
@@ -3165,7 +3455,7 @@
         </w:tc>
         <w:tc>
           <w:tcPr>
-            <w:tcW w:type="dxa" w:w="4680"/>
+            <w:tcW w:type="dxa" w:w="7824"/>
           </w:tcPr>
           <w:p>
             <w:r>
@@ -3183,9 +3473,12 @@
         </w:tc>
       </w:tr>
       <w:tr>
+        <w:trPr>
+          <w:cantSplit/>
+        </w:trPr>
         <w:tc>
           <w:tcPr>
-            <w:tcW w:type="dxa" w:w="4680"/>
+            <w:tcW w:type="dxa" w:w="2256"/>
           </w:tcPr>
           <w:p>
             <w:r>
@@ -3203,7 +3496,7 @@
         </w:tc>
         <w:tc>
           <w:tcPr>
-            <w:tcW w:type="dxa" w:w="4680"/>
+            <w:tcW w:type="dxa" w:w="7824"/>
           </w:tcPr>
           <w:p>
             <w:r>
@@ -3331,7 +3624,7 @@
     </w:p>
     <w:sectPr>
       <w:pgSz w:w="12240" w:h="15840"/>
-      <w:pgMar w:top="1440" w:right="1440" w:bottom="1440" w:left="1440" w:header="720" w:footer="720" w:gutter="0"/>
+      <w:pgMar w:top="1440" w:right="1080" w:bottom="1440" w:left="1080" w:header="720" w:footer="720" w:gutter="0"/>
       <w:cols w:space="720"/>
       <w:docGrid w:linePitch="360"/>
     </w:sectPr>

</xml_diff>